<commit_message>
Save the user's edited full text as the current reading version
Moves the colleague/shift story into part 2, adds the autopilot-drive example
and the AI aside in part 3, and the user's own wording throughout. Regenerated
the clean PDF and the editable Word file from it.

Co-Authored-By: Claude Opus 5.5 <noreply@anthropic.com>
Claude-Session: https://claude.ai/code/session_01QdVJcefjKXQoLjgyoNP2jG
</commit_message>
<xml_diff>
--- a/exports/לתכנת-את-המוח-לעריכה.docx
+++ b/exports/לתכנת-את-המוח-לעריכה.docx
@@ -167,49 +167,49 @@
           <w:rFonts w:ascii="Arial" w:cs="Arial" w:hAnsi="Arial"/>
           <w:rtl/>
         </w:rPr>
-        <w:t xml:space="preserve">ובכל פעם הגענו לאותו מקום.</w:t>
-      </w:r>
-    </w:p>
-    <w:p>
-      <w:pPr>
-        <w:bidi/>
-        <w:spacing w:after="160" w:line="360"/>
-        <w:jc w:val="both"/>
-      </w:pPr>
-      <w:r>
-        <w:rPr>
-          <w:rFonts w:ascii="Arial" w:cs="Arial" w:hAnsi="Arial"/>
-          <w:rtl/>
-        </w:rPr>
-        <w:t xml:space="preserve">בעבודה? לא משנה כמה חיפשנו, לא מצאנו משרות כאלה. לא מוצאים, לא קיים, אין כאלה. איך כולם מוצאים ואנחנו לא?</w:t>
-      </w:r>
-    </w:p>
-    <w:p>
-      <w:pPr>
-        <w:bidi/>
-        <w:spacing w:after="160" w:line="360"/>
-        <w:jc w:val="both"/>
-      </w:pPr>
-      <w:r>
-        <w:rPr>
-          <w:rFonts w:ascii="Arial" w:cs="Arial" w:hAnsi="Arial"/>
-          <w:rtl/>
-        </w:rPr>
-        <w:t xml:space="preserve">ובמשפחה ובחברים? כמעט כולם אמרו לנו: "למה אתם צריכים את זה? מה זה ייתן לכם? למה להתעקש? למה להיות שונים?" והיו גם כאלה שלא אמרו כלום, רק נתנו את התחושה: "בסדר, תנסו. לא תצליחו."</w:t>
-      </w:r>
-    </w:p>
-    <w:p>
-      <w:pPr>
-        <w:bidi/>
-        <w:spacing w:after="160" w:line="360"/>
-        <w:jc w:val="both"/>
-      </w:pPr>
-      <w:r>
-        <w:rPr>
-          <w:rFonts w:ascii="Arial" w:cs="Arial" w:hAnsi="Arial"/>
-          <w:rtl/>
-        </w:rPr>
-        <w:t xml:space="preserve">אי אפשר. לא עכשיו. מחר. עוד שנה.</w:t>
+        <w:t xml:space="preserve">ובכל פעם הבנו שנשארנו בדיוק באותו המקום,</w:t>
+      </w:r>
+    </w:p>
+    <w:p>
+      <w:pPr>
+        <w:bidi/>
+        <w:spacing w:after="160" w:line="360"/>
+        <w:jc w:val="both"/>
+      </w:pPr>
+      <w:r>
+        <w:rPr>
+          <w:rFonts w:ascii="Arial" w:cs="Arial" w:hAnsi="Arial"/>
+          <w:rtl/>
+        </w:rPr>
+        <w:t xml:space="preserve">לא מוצאים עבודה מרחוק לא משנה לאן שלחתי קורות חיים ומה חשבתי שחיפשתי, לא משנה כמה ותמיד חזרה המנטרה והמחשבה וההרגל : לא מוצאים, לא קיים, אין כאלה. איך כולם מוצאים ואנחנו לא?</w:t>
+      </w:r>
+    </w:p>
+    <w:p>
+      <w:pPr>
+        <w:bidi/>
+        <w:spacing w:after="160" w:line="360"/>
+        <w:jc w:val="both"/>
+      </w:pPr>
+      <w:r>
+        <w:rPr>
+          <w:rFonts w:ascii="Arial" w:cs="Arial" w:hAnsi="Arial"/>
+          <w:rtl/>
+        </w:rPr>
+        <w:t xml:space="preserve">ובתוך המשפחה והחברים? כמעט כולם אמרו לנו: "למה אתם צריכים את זה? מה זה ייתן לכם? למה להתעקש? למה להיות שונים?" והיו גם כאלה שלא אמרו כלום, רק נתנו את התחושה: "בסדר, תנסו. לא תצליחו."</w:t>
+      </w:r>
+    </w:p>
+    <w:p>
+      <w:pPr>
+        <w:bidi/>
+        <w:spacing w:after="160" w:line="360"/>
+        <w:jc w:val="both"/>
+      </w:pPr>
+      <w:r>
+        <w:rPr>
+          <w:rFonts w:ascii="Arial" w:cs="Arial" w:hAnsi="Arial"/>
+          <w:rtl/>
+        </w:rPr>
+        <w:t xml:space="preserve">ותמיד חוזרת המנטרה שוב ושוב אי אפשר. לא עכשיו. מחר. עוד שנה.</w:t>
       </w:r>
     </w:p>
     <w:p>
@@ -237,21 +237,21 @@
           <w:rFonts w:ascii="Arial" w:cs="Arial" w:hAnsi="Arial"/>
           <w:rtl/>
         </w:rPr>
-        <w:t xml:space="preserve">ובינתיים עלינו על רכבת, גם זאת שעל הפסים וגם האחרת. קם בבוקר לפני שמישהו בכלל חושב להתעורר, מתארגן מהר-מהר, פקק בדרך לרכבת, הרכבת מתעכבת, ומגיע לעבודה כשחצי יום כבר נשרף. ואז יושבים מול המקלדת בלי לזוז, שחס וחלילה לא תהיה לנו הפסקה. נגמר היום, חוזרים הביתה, ולפעמים מפספסים את הרכבת ומחכים שעה לבאה, במקרה הטוב. וכולם מגיעים לעבודה חולים, כי אסור לפספס יום.</w:t>
-      </w:r>
-    </w:p>
-    <w:p>
-      <w:pPr>
-        <w:bidi/>
-        <w:spacing w:after="160" w:line="360"/>
-        <w:jc w:val="both"/>
-      </w:pPr>
-      <w:r>
-        <w:rPr>
-          <w:rFonts w:ascii="Arial" w:cs="Arial" w:hAnsi="Arial"/>
-          <w:rtl/>
-        </w:rPr>
-        <w:t xml:space="preserve">זאת הייתה הרכבת שלי. לא רק זאת שעל הפסים, אלא הרכבת של החיים.</w:t>
+        <w:t xml:space="preserve">ובינתיים המשכנו כמו כולם לעלות על רכבות , גם זאת שעל הפסים וגם המטאפורית. קם בבוקר לפני שמישהו בכלל חושב להתעורר, מתארגן מהר-מהר, פקק בדרך לרכבת, הרכבת מתעכבת, ומגיע לעבודה כשחצי יום כבר נשרף. ואז יושבים מול המקלדת בלי לזוז, שחס וחלילה לא תהיה לנו הפסקה. נגמר היום, חוזרים הביתה, ולפעמים מפספסים את הרכבת ומחכים שעה לבאה, במקרה הטוב. וכולם מגיעים לעבודה חולים, כי אסור לפספס יום.</w:t>
+      </w:r>
+    </w:p>
+    <w:p>
+      <w:pPr>
+        <w:bidi/>
+        <w:spacing w:after="160" w:line="360"/>
+        <w:jc w:val="both"/>
+      </w:pPr>
+      <w:r>
+        <w:rPr>
+          <w:rFonts w:ascii="Arial" w:cs="Arial" w:hAnsi="Arial"/>
+          <w:rtl/>
+        </w:rPr>
+        <w:t xml:space="preserve">זאת הייתה הרכבת שלי. שכל אחד יחשוב איפה הרכבת שלו, לא רק זאת שעל הפסים, אלא הרכבת של החיים.</w:t>
       </w:r>
     </w:p>
     <w:p>
@@ -279,21 +279,49 @@
           <w:rFonts w:ascii="Arial" w:cs="Arial" w:hAnsi="Arial"/>
           <w:rtl/>
         </w:rPr>
-        <w:t xml:space="preserve">ואז הגיע השביעי באוקטובר. ישבתי נעול בממ"ד, ושם, בפעם הראשונה, הבנתי: אני נעול בממ"ד כבר שנים. ממ"ד שנקרא "אי אפשר", "לא עכשיו", "מחר", "עוד שנה".</w:t>
-      </w:r>
-    </w:p>
-    <w:p>
-      <w:pPr>
-        <w:bidi/>
-        <w:spacing w:after="160" w:line="360"/>
-        <w:jc w:val="both"/>
-      </w:pPr>
-      <w:r>
-        <w:rPr>
-          <w:rFonts w:ascii="Arial" w:cs="Arial" w:hAnsi="Arial"/>
-          <w:rtl/>
-        </w:rPr>
-        <w:t xml:space="preserve">ואז משהו זז, אבל עדיין לא ידעתי לאן. כל יום ראיתי ושמעתי על אנשים שעזבו הכול, על אנשים ששינו משהו, על אנשים שפשוט התחילו לזוז. ואני? עדיין רצתי לרכבת.</w:t>
+        <w:t xml:space="preserve">יום אחד, בעבודה שהייתי בה כבר שנים, קולגה זרק לי משפט בזלזול, משהו כמו: "אתה? לא מסוגל." להתקדם, להיות במקום אחר, מתפתח יותר. ובאותה תקופה, האמת, באמת הרגשתי תקוע, בנוח שלי. וזאת הייתה עוד סטירה, אבל הפעם ישר למוח. היא איפסה אותי.</w:t>
+      </w:r>
+    </w:p>
+    <w:p>
+      <w:pPr>
+        <w:bidi/>
+        <w:spacing w:after="160" w:line="360"/>
+        <w:jc w:val="both"/>
+      </w:pPr>
+      <w:r>
+        <w:rPr>
+          <w:rFonts w:ascii="Arial" w:cs="Arial" w:hAnsi="Arial"/>
+          <w:rtl/>
+        </w:rPr>
+        <w:t xml:space="preserve">ואז, פאסט פורוורד: עשיתי שיפט. הגעתי ליעדים שהצבתי לעצמי, עבדתי בחברות כמו פלייטיקה וצ'ק פוינט, והאופי שלי השתנה במאה שמונים מעלות. גיליתי בעצמי יכולות שלא הכרתי רוב החיים שלי.</w:t>
+      </w:r>
+    </w:p>
+    <w:p>
+      <w:pPr>
+        <w:bidi/>
+        <w:spacing w:after="160" w:line="360"/>
+        <w:jc w:val="both"/>
+      </w:pPr>
+      <w:r>
+        <w:rPr>
+          <w:rFonts w:ascii="Arial" w:cs="Arial" w:hAnsi="Arial"/>
+          <w:rtl/>
+        </w:rPr>
+        <w:t xml:space="preserve">ואז לימים הגיע השביעי באוקטובר. ישבתי נעול בממ"ד, קרה כל מה שקרה ולאט לאט בפעם הראשונה, הבנתי: לא הייתי נעול בממ“ד רק באותו היום, מטאפורית אני כבר שנים. ממ"ד שנקרא "אי אפשר", "לא עכשיו", "מחר", "עוד שנה“.</w:t>
+      </w:r>
+    </w:p>
+    <w:p>
+      <w:pPr>
+        <w:bidi/>
+        <w:spacing w:after="160" w:line="360"/>
+        <w:jc w:val="both"/>
+      </w:pPr>
+      <w:r>
+        <w:rPr>
+          <w:rFonts w:ascii="Arial" w:cs="Arial" w:hAnsi="Arial"/>
+          <w:rtl/>
+        </w:rPr>
+        <w:t xml:space="preserve">ואז משהו התחיל לזוז, אבל עדיין לא ידעתי לאן. כל יום ראיתי ושמעתי על אנשים שעזבו הכול, על אנשים ששינו משהו, על אנשים שפשוט התחילו לזוז. ואני? עדיין רצתי לרכבת.</w:t>
       </w:r>
     </w:p>
     <w:p>
@@ -405,21 +433,21 @@
           <w:rFonts w:ascii="Arial" w:cs="Arial" w:hAnsi="Arial"/>
           <w:rtl/>
         </w:rPr>
-        <w:t xml:space="preserve">אני רוצה לספר לכם עוד משהו עליי: אני מתכנת במקצוע. כל היום אני כותב קוד, אומר למחשב מה לעשות, והוא עושה בדיוק מה שכתבתי. לא פחות ולא יותר.</w:t>
-      </w:r>
-    </w:p>
-    <w:p>
-      <w:pPr>
-        <w:bidi/>
-        <w:spacing w:after="160" w:line="360"/>
-        <w:jc w:val="both"/>
-      </w:pPr>
-      <w:r>
-        <w:rPr>
-          <w:rFonts w:ascii="Arial" w:cs="Arial" w:hAnsi="Arial"/>
-          <w:rtl/>
-        </w:rPr>
-        <w:t xml:space="preserve">ויום אחד הבנתי שגם המוח שלנו מריץ קוד.</w:t>
+        <w:t xml:space="preserve">אני רוצה לספר לכם עוד משהו עליי: אני מתכנת במקצוע. כל היום אני כותב קוד כבר המון שנים, מתכנת את המחשב ואומר למחשב מה לעשות, והוא עושה בדיוק מה שכתבתי. לא פחות ולא יותר. (וכן הרבה לפני הai מי ששאל)</w:t>
+      </w:r>
+    </w:p>
+    <w:p>
+      <w:pPr>
+        <w:bidi/>
+        <w:spacing w:after="160" w:line="360"/>
+        <w:jc w:val="both"/>
+      </w:pPr>
+      <w:r>
+        <w:rPr>
+          <w:rFonts w:ascii="Arial" w:cs="Arial" w:hAnsi="Arial"/>
+          <w:rtl/>
+        </w:rPr>
+        <w:t xml:space="preserve">ויום אחד הבנתי שגם המוח שלנו מריץ קוד, גם את המוח שלנו אפשר לתכנת.</w:t>
       </w:r>
     </w:p>
     <w:p>
@@ -461,7 +489,21 @@
           <w:rFonts w:ascii="Arial" w:cs="Arial" w:hAnsi="Arial"/>
           <w:rtl/>
         </w:rPr>
-        <w:t xml:space="preserve">אז איך הקוד הזה נכתב? פסיכיאטר בשם ג'דסון ברואר הסביר את זה בהרצאת TED בשלוש מילים: טריגר, פעולה, תגמול. אנחנו רעבים, אוכלים עוגה ומרגישים טוב, שמחים ורגועים. והמוח רושם: זה עובד. ואז הוא נהיה יצירתי: "רגע, אם זה עובד על רעב, למה לא על עוד דברים?" נפרדנו מבן זוג? פיטרו אותנו? סתם קשה לנו? עוגה, שוקולד, גלידה, והופ, כבר יותר טוב. והמוח מאמץ את זה כהרגל, על כל דבר.</w:t>
+        <w:t xml:space="preserve">כמה פעמים יצא לכם שהגעתם הביתה ואמרתם לעצמכם וואי איך הגעתי עד לפה, נסעתם על אוטומט עד לבית, הרגל אתם כבר מתורגלים בדרך שלכם הביתה מה שנקרא בעיניים עצומות</w:t>
+      </w:r>
+    </w:p>
+    <w:p>
+      <w:pPr>
+        <w:bidi/>
+        <w:spacing w:after="160" w:line="360"/>
+        <w:jc w:val="both"/>
+      </w:pPr>
+      <w:r>
+        <w:rPr>
+          <w:rFonts w:ascii="Arial" w:cs="Arial" w:hAnsi="Arial"/>
+          <w:rtl/>
+        </w:rPr>
+        <w:t xml:space="preserve">אז איך הקוד הזה נכתב? למשל: פסיכיאטר בשם ג'דסון ברואר הסביר את זה בהרצאת TED בשלוש מילים: טריגר, פעולה, תגמול. אנחנו רעבים, אוכלים עוגה ומרגישים טוב, שמחים ורגועים. והמוח רושם: זה עובד. ואז הוא נהיה יצירתי: "רגע, אם זה עובד על רעב, למה לא על עוד דברים?" נפרדנו מבן זוג? פיטרו אותנו? סתם קשה לנו? עוגה, שוקולד, גלידה, והופ, כבר יותר טוב. והמוח מאמץ את זה כהרגל, על כל דבר.</w:t>
       </w:r>
     </w:p>
     <w:p>
@@ -503,7 +545,35 @@
           <w:rFonts w:ascii="Arial" w:cs="Arial" w:hAnsi="Arial"/>
           <w:rtl/>
         </w:rPr>
-        <w:t xml:space="preserve">אבל יש גם חדשות טובות. חוקרת מוח בשם ליסה פלדמן בארט חקרה רגשות עשרים וחמש שנה, והגיעה למסקנה מפתיעה: רגשות לא קורים לנו, המוח שלנו בונה אותם. מתוך מה שהוא ראה, מתוך מה שהוא למד, מתוך המקום שבו גדלנו. ומה שנבנה, אפשר לבנות אחרת.</w:t>
+        <w:t xml:space="preserve">אבל יש גם חדשות טובות. לדוגמה :</w:t>
+      </w:r>
+    </w:p>
+    <w:p>
+      <w:pPr>
+        <w:bidi/>
+        <w:spacing w:after="160" w:line="360"/>
+        <w:jc w:val="both"/>
+      </w:pPr>
+      <w:r>
+        <w:rPr>
+          <w:rFonts w:ascii="Arial" w:cs="Arial" w:hAnsi="Arial"/>
+          <w:rtl/>
+        </w:rPr>
+        <w:t xml:space="preserve">חוקרת מוח בשם ליסה פלדמן בארט חקרה רגשות עשרים וחמש שנה, והגיעה למסקנה מפתיעה: רגשות לא קורים לנו, המוח שלנו בונה אותם. מתוך מה שהוא ראה, מתוך מה שהוא למד, מתוך המקום שבו גדלנו. ומה שנבנה, אפשר לבנות אחרת.</w:t>
+      </w:r>
+    </w:p>
+    <w:p>
+      <w:pPr>
+        <w:bidi/>
+        <w:spacing w:after="160" w:line="360"/>
+        <w:jc w:val="both"/>
+      </w:pPr>
+      <w:r>
+        <w:rPr>
+          <w:rFonts w:ascii="Arial" w:cs="Arial" w:hAnsi="Arial"/>
+          <w:rtl/>
+        </w:rPr>
+        <w:t xml:space="preserve">ואתם יודעים כמה זמן זה לוקח לתקן הרגל? חוקרים בלונדון עקבו אחרי אנשים שניסו להתקין הרגל חדש אחד, פשוט, כל יום. בדרך כלל זה לקח בערך 66 יום. אצל חלק 18, ואצל אחרים יותר מ-250. והחלק הכי טוב: מי שפספס יום לא חזר לאפס. הקוד המשיך להיכתב.</w:t>
       </w:r>
     </w:p>
     <w:p>
@@ -531,63 +601,7 @@
           <w:rFonts w:ascii="Arial" w:cs="Arial" w:hAnsi="Arial"/>
           <w:rtl/>
         </w:rPr>
-        <w:t xml:space="preserve">קפצתי ממטוס, פעמיים.</w:t>
-      </w:r>
-    </w:p>
-    <w:p>
-      <w:pPr>
-        <w:bidi/>
-        <w:spacing w:after="160" w:line="360"/>
-        <w:jc w:val="both"/>
-      </w:pPr>
-      <w:r>
-        <w:rPr>
-          <w:rFonts w:ascii="Arial" w:cs="Arial" w:hAnsi="Arial"/>
-          <w:rtl/>
-        </w:rPr>
-        <w:t xml:space="preserve">ויום אחד, בעבודה שהייתי בה כבר שנים, קולגה זרק לי משפט בזלזול, משהו כמו: "אתה? לא מסוגל." להתקדם, להיות במקום אחר, מתפתח יותר. ובאותה תקופה, האמת, באמת הרגשתי תקוע, בנוח שלי. וזאת הייתה עוד סטירה, אבל הפעם ישר למוח. היא איפסה אותי.</w:t>
-      </w:r>
-    </w:p>
-    <w:p>
-      <w:pPr>
-        <w:bidi/>
-        <w:spacing w:after="160" w:line="360"/>
-        <w:jc w:val="both"/>
-      </w:pPr>
-      <w:r>
-        <w:rPr>
-          <w:rFonts w:ascii="Arial" w:cs="Arial" w:hAnsi="Arial"/>
-          <w:rtl/>
-        </w:rPr>
-        <w:t xml:space="preserve">ואז, פאסט פורוורד: עשיתי שיפט. הגעתי ליעדים שהצבתי לעצמי, עבדתי בחברות כמו פלייטיקה וצ'ק פוינט, והאופי שלי השתנה במאה שמונים מעלות. גיליתי בעצמי יכולות שלא הכרתי רוב החיים שלי.</w:t>
-      </w:r>
-    </w:p>
-    <w:p>
-      <w:pPr>
-        <w:bidi/>
-        <w:spacing w:after="160" w:line="360"/>
-        <w:jc w:val="both"/>
-      </w:pPr>
-      <w:r>
-        <w:rPr>
-          <w:rFonts w:ascii="Arial" w:cs="Arial" w:hAnsi="Arial"/>
-          <w:rtl/>
-        </w:rPr>
-        <w:t xml:space="preserve">"אתה לא מסוגל" היה הטריגר. והפעם כתבתי לו פעולה אחרת.</w:t>
-      </w:r>
-    </w:p>
-    <w:p>
-      <w:pPr>
-        <w:bidi/>
-        <w:spacing w:after="160" w:line="360"/>
-        <w:jc w:val="both"/>
-      </w:pPr>
-      <w:r>
-        <w:rPr>
-          <w:rFonts w:ascii="Arial" w:cs="Arial" w:hAnsi="Arial"/>
-          <w:rtl/>
-        </w:rPr>
-        <w:t xml:space="preserve">ואתם יודעים כמה זמן זה לוקח? חוקרים בלונדון עקבו אחרי אנשים שניסו להתקין הרגל חדש אחד, פשוט, כל יום. בדרך כלל זה לקח בערך 66 יום. אצל חלק 18, ואצל אחרים יותר מ-250. והחלק הכי טוב: מי שפספס יום לא חזר לאפס. הקוד המשיך להיכתב.</w:t>
+        <w:t xml:space="preserve">למשל קפצתי ממטוס, פעמיים.</w:t>
       </w:r>
     </w:p>
     <w:p>
@@ -643,7 +657,7 @@
           <w:rFonts w:ascii="Arial" w:cs="Arial" w:hAnsi="Arial"/>
           <w:rtl/>
         </w:rPr>
-        <w:t xml:space="preserve">ילד לא לומד לפחד מכלבים מהכלב. הוא לומד את זה מהפנים של אמא שלו כשהכלב עובר. וזה לא רק משפט יפה: חוקרים הראו את זה במעבדה. ילדים שראו הורה מפחד ממשהו התחילו לפחד ממנו בעצמם, גם כשלא קרה להם כלום.</w:t>
+        <w:t xml:space="preserve">ילד לא לומד לפחד מכלבים לבדו. הוא לומד את זה מהפנים של אמא שלו כשהכלב עובר. וזה לא רק משפט יפה: חוקרים הראו את זה במעבדה. ילדים שראו הורה מפחד ממשהו התחילו לפחד מאותו הדבר בעצמם, גם כשלא קרה להם כלום.</w:t>
       </w:r>
     </w:p>
     <w:p>
@@ -909,7 +923,7 @@
           <w:rFonts w:ascii="Arial" w:cs="Arial" w:hAnsi="Arial"/>
           <w:rtl/>
         </w:rPr>
-        <w:t xml:space="preserve">יום אחד ישבתי וקראתי כתבה על מישהו שעשה רילוקיישן, ואמרתי: זהו. אין שום דבר שאני לא יכול לעשות. אנחנו עוברים, מממשים את החלום, את מה שאנחנו רוצים כבר שנים. קובעים תאריך יעד ועוזבים הכול, כמו פלסטר. אני, אשתי, הבן הקטן שלנו ושני כלבים.</w:t>
+        <w:t xml:space="preserve">יום אחד ישבתי וקראתי כתבה על מישהו שעשה רילוקיישן, ואמרתי: זהו. אין שום דבר שהוא יכול לעשות ואני לא. אנחנו עוברים, מממשים את החלום, את מה שאנחנו רוצים כבר שנים. קובעים תאריך יעד ועוזבים הכול, כמו פלסטר. אני, אשתי, הבן הקטן שלנו ושני כלבים.</w:t>
       </w:r>
     </w:p>
     <w:p>
@@ -965,21 +979,21 @@
           <w:rFonts w:ascii="Arial" w:cs="Arial" w:hAnsi="Arial"/>
           <w:rtl/>
         </w:rPr>
-        <w:t xml:space="preserve">"אין משרות כאלה", זוכרים? זאת הייתה אמונה. עכשיו זאת ידיעה.</w:t>
-      </w:r>
-    </w:p>
-    <w:p>
-      <w:pPr>
-        <w:bidi/>
-        <w:spacing w:after="160" w:line="360"/>
-        <w:jc w:val="both"/>
-      </w:pPr>
-      <w:r>
-        <w:rPr>
-          <w:rFonts w:ascii="Arial" w:cs="Arial" w:hAnsi="Arial"/>
-          <w:rtl/>
-        </w:rPr>
-        <w:t xml:space="preserve">ולא, זה לא היה סרט. נתקענו בבירוקרטיה, והיינו צריכים אפילו לחזור לארץ. ארבעה חודשים, כולל מלחמה עם איראן. אבל לא ויתרתי על שום דבר שכבר החלטתי. ואחרי ארבעה חודשים לקחנו איתנו גם את הכלבים, ועזבנו. פור גוד.</w:t>
+        <w:t xml:space="preserve">"אין משרות כאלה", זוכרים? זאת הייתה אמונה, אמונה מגבילה. עכשיו זאת ידיעה.</w:t>
+      </w:r>
+    </w:p>
+    <w:p>
+      <w:pPr>
+        <w:bidi/>
+        <w:spacing w:after="160" w:line="360"/>
+        <w:jc w:val="both"/>
+      </w:pPr>
+      <w:r>
+        <w:rPr>
+          <w:rFonts w:ascii="Arial" w:cs="Arial" w:hAnsi="Arial"/>
+          <w:rtl/>
+        </w:rPr>
+        <w:t xml:space="preserve">ולא, זה לא היה סרט. נתקענו בבירוקרטיות עם הויזה, והיינו צריכים אפילו לחזור לארץ. ארבעה חודשים, כולל מלחמה עם איראן. אבל לא ויתרתי על שום דבר שכבר החלטתי המוח כבר היה מתוכנת מידי ומחווט מידי. ואחרי ארבעה חודשים לקחנו איתנו גם את הכלבים, ועזבנו. פור גוד.</w:t>
       </w:r>
     </w:p>
     <w:p>

</xml_diff>

<commit_message>
Final text 3.10: new parts 1-2, parts 3/4 swapped, Dispenza and Sinek in part 4
- reading-version.md: user's new version, lightly edited; part 2 renamed
  to נקודת המפנה; Dispenza/quantum notes as attributed, speakable prose
- script.md and editor: stage version synced, word-for-word with the prose
- outline, booklet summaries, docx titles follow the new structure
- exports rebuilt (booklet, clean text, editable RTL docx)
- references: part numbers swapped; Pascual-Leone, Dispenza, Sinek added
- inbox: full message archived verbatim

Co-Authored-By: Claude Opus 5.5 <noreply@anthropic.com>
Claude-Session: https://claude.ai/code/session_01QdVJcefjKXQoLjgyoNP2jG
</commit_message>
<xml_diff>
--- a/exports/לתכנת-את-המוח-לעריכה.docx
+++ b/exports/לתכנת-את-המוח-לעריכה.docx
@@ -69,49 +69,49 @@
           <w:rFonts w:ascii="Arial" w:cs="Arial" w:hAnsi="Arial"/>
           <w:rtl/>
         </w:rPr>
-        <w:t xml:space="preserve">גדלתי עם אמא חד-הורית מגיל מאוד צעיר, אמא שעבדה בכמה עבודות במקביל כדי שיהיה. ואבא שלי? הוא לא ממש היה שם, עד גיל מאוד מאוחר.</w:t>
-      </w:r>
-    </w:p>
-    <w:p>
-      <w:pPr>
-        <w:bidi/>
-        <w:spacing w:after="160" w:line="360"/>
-        <w:jc w:val="both"/>
-      </w:pPr>
-      <w:r>
-        <w:rPr>
-          <w:rFonts w:ascii="Arial" w:cs="Arial" w:hAnsi="Arial"/>
-          <w:rtl/>
-        </w:rPr>
-        <w:t xml:space="preserve">אז גידלתי את עצמי, בהרבה מאוד מובנים. מגיל קטן הייתי עצמאי מאוד, וזה עשה ממני ילד חדור מטרה. ידעתי בדיוק מה אני רוצה, ואף אחד לא הצליח להסיט אותי, לא ימינה ולא שמאלה.</w:t>
-      </w:r>
-    </w:p>
-    <w:p>
-      <w:pPr>
-        <w:bidi/>
-        <w:spacing w:after="160" w:line="360"/>
-        <w:jc w:val="both"/>
-      </w:pPr>
-      <w:r>
-        <w:rPr>
-          <w:rFonts w:ascii="Arial" w:cs="Arial" w:hAnsi="Arial"/>
-          <w:rtl/>
-        </w:rPr>
-        <w:t xml:space="preserve">ותמיד, תמיד, הרגשתי עוף מוזר. שונה.</w:t>
-      </w:r>
-    </w:p>
-    <w:p>
-      <w:pPr>
-        <w:bidi/>
-        <w:spacing w:after="160" w:line="360"/>
-        <w:jc w:val="both"/>
-      </w:pPr>
-      <w:r>
-        <w:rPr>
-          <w:rFonts w:ascii="Arial" w:cs="Arial" w:hAnsi="Arial"/>
-          <w:rtl/>
-        </w:rPr>
-        <w:t xml:space="preserve">ולא רק הרגשתי, גם עשיתי. תמיד הלכתי הפוך מכולם, הפוך מהנורמה. כולם הלכו ללמוד תואר? אני החלטתי ללכת בדיוק במסלול ההפוך, עד הסוף. אנשים עושים קעקוע של דקל בשריר האחורי של הרגל, נכון? אז אני עשיתי אותו מקדימה. כן, אני יודע.</w:t>
+        <w:t xml:space="preserve">אז קודם כל, נעים מאוד, אני יפתח. גדלתי עם אמא חד-הורית מגיל מאוד צעיר, אמא שעבדה בכמה עבודות במקביל כדי שיהיה. ואבא שלי? הוא לא ממש היה שם, עד גיל מאוד מאוחר.</w:t>
+      </w:r>
+    </w:p>
+    <w:p>
+      <w:pPr>
+        <w:bidi/>
+        <w:spacing w:after="160" w:line="360"/>
+        <w:jc w:val="both"/>
+      </w:pPr>
+      <w:r>
+        <w:rPr>
+          <w:rFonts w:ascii="Arial" w:cs="Arial" w:hAnsi="Arial"/>
+          <w:rtl/>
+        </w:rPr>
+        <w:t xml:space="preserve">אז בהרבה מקומות הרגשתי שגידלתי את עצמי. מגיל קטן הייתי עצמאי מאוד, וזה עשה ממני ילד שרוב הזמן הרגיש שהוא יודע מה הוא עושה, ילד מאוד חדור מטרה. רוב הזמן ידעתי מאוד מה אני רוצה לעשות, ואף אחד לא הצליח להסיט אותי, לא ימינה ולא שמאלה.</w:t>
+      </w:r>
+    </w:p>
+    <w:p>
+      <w:pPr>
+        <w:bidi/>
+        <w:spacing w:after="160" w:line="360"/>
+        <w:jc w:val="both"/>
+      </w:pPr>
+      <w:r>
+        <w:rPr>
+          <w:rFonts w:ascii="Arial" w:cs="Arial" w:hAnsi="Arial"/>
+          <w:rtl/>
+        </w:rPr>
+        <w:t xml:space="preserve">בנוסף לזה, אני חושב שבעיקר בתחילת התיכון הרגשתי שאני שונה. הרגשתי עוף מוזר.</w:t>
+      </w:r>
+    </w:p>
+    <w:p>
+      <w:pPr>
+        <w:bidi/>
+        <w:spacing w:after="160" w:line="360"/>
+        <w:jc w:val="both"/>
+      </w:pPr>
+      <w:r>
+        <w:rPr>
+          <w:rFonts w:ascii="Arial" w:cs="Arial" w:hAnsi="Arial"/>
+          <w:rtl/>
+        </w:rPr>
+        <w:t xml:space="preserve">ובדרך כלל זה גם אומר ללכת הפוך מהנורמה. אז מה זה אומר, אתם שואלים? למשל, בגיל מאוחר יותר, כולם הלכו ללמוד תואר? אני החלטתי ללכת בדיוק במסלול ההפוך, עד הסוף. אנשים עושים קעקוע של דקל בשריר האחורי של הרגל, נכון? אז אני עשיתי אותו מקדימה. כן, אני יודע.</w:t>
       </w:r>
     </w:p>
     <w:p>
@@ -139,7 +139,7 @@
           <w:rFonts w:ascii="Arial" w:cs="Arial" w:hAnsi="Arial"/>
           <w:rtl/>
         </w:rPr>
-        <w:t xml:space="preserve">ואצל העוף המוזר הזה, מאז ומתמיד, היה רצון אחד: לצאת ולראות עולם. כשהייתי קטן זה היה אולי לעשות עגלות בחול, וכשגדלתי זה נהיה רילוקיישן, לאנשהו, אפילו לתקופה. ואז גיליתי שהאישה שבחרתי לחיים שלי חולקת איתי בדיוק את אותו הרצון.</w:t>
+        <w:t xml:space="preserve">ואצל העוף המוזר הזה, מאז ומתמיד, היה רצון אחד: לעשות דברים אחרת. כשהייתי צעיר יותר זאת הייתה המחשבה לעשות אולי עגלות בחול, וכשגדלתי התחיל לבעור בי מאוד רילוקיישן, לאנשהו, אפילו לתקופה. ואז גיליתי שהאישה שבחרתי לחיים שלי חולקת איתי בדיוק את אותו הרצון.</w:t>
       </w:r>
     </w:p>
     <w:p>
@@ -167,49 +167,35 @@
           <w:rFonts w:ascii="Arial" w:cs="Arial" w:hAnsi="Arial"/>
           <w:rtl/>
         </w:rPr>
-        <w:t xml:space="preserve">ובכל פעם הבנו שנשארנו בדיוק באותו המקום,</w:t>
-      </w:r>
-    </w:p>
-    <w:p>
-      <w:pPr>
-        <w:bidi/>
-        <w:spacing w:after="160" w:line="360"/>
-        <w:jc w:val="both"/>
-      </w:pPr>
-      <w:r>
-        <w:rPr>
-          <w:rFonts w:ascii="Arial" w:cs="Arial" w:hAnsi="Arial"/>
-          <w:rtl/>
-        </w:rPr>
-        <w:t xml:space="preserve">לא מוצאים עבודה מרחוק לא משנה לאן שלחתי קורות חיים ומה חשבתי שחיפשתי, לא משנה כמה ותמיד חזרה המנטרה והמחשבה וההרגל : לא מוצאים, לא קיים, אין כאלה. איך כולם מוצאים ואנחנו לא?</w:t>
-      </w:r>
-    </w:p>
-    <w:p>
-      <w:pPr>
-        <w:bidi/>
-        <w:spacing w:after="160" w:line="360"/>
-        <w:jc w:val="both"/>
-      </w:pPr>
-      <w:r>
-        <w:rPr>
-          <w:rFonts w:ascii="Arial" w:cs="Arial" w:hAnsi="Arial"/>
-          <w:rtl/>
-        </w:rPr>
-        <w:t xml:space="preserve">ובתוך המשפחה והחברים? כמעט כולם אמרו לנו: "למה אתם צריכים את זה? מה זה ייתן לכם? למה להתעקש? למה להיות שונים?" והיו גם כאלה שלא אמרו כלום, רק נתנו את התחושה: "בסדר, תנסו. לא תצליחו."</w:t>
-      </w:r>
-    </w:p>
-    <w:p>
-      <w:pPr>
-        <w:bidi/>
-        <w:spacing w:after="160" w:line="360"/>
-        <w:jc w:val="both"/>
-      </w:pPr>
-      <w:r>
-        <w:rPr>
-          <w:rFonts w:ascii="Arial" w:cs="Arial" w:hAnsi="Arial"/>
-          <w:rtl/>
-        </w:rPr>
-        <w:t xml:space="preserve">ותמיד חוזרת המנטרה שוב ושוב אי אפשר. לא עכשיו. מחר. עוד שנה.</w:t>
+        <w:t xml:space="preserve">ובכל זאת, בכל פעם הזמן עבר והמשיך, ובכל פעם, בנקודה מסוימת, כשעצרנו רגע ואמרנו "טוב, מה עכשיו?", הבנו שנשארנו בדיוק באותו המקום. לא מוצאים עבודה מרחוק. לא משנה לאן שלחתי קורות חיים, מה חשבתי שאני מחפש, לא משנה כמה. ותמיד חזרו המנטרה, המחשבה, ההרגל: לא מוצאים, לא קיים, אין כאלה. איך כולם מוצאים ואנחנו לא?</w:t>
+      </w:r>
+    </w:p>
+    <w:p>
+      <w:pPr>
+        <w:bidi/>
+        <w:spacing w:after="160" w:line="360"/>
+        <w:jc w:val="both"/>
+      </w:pPr>
+      <w:r>
+        <w:rPr>
+          <w:rFonts w:ascii="Arial" w:cs="Arial" w:hAnsi="Arial"/>
+          <w:rtl/>
+        </w:rPr>
+        <w:t xml:space="preserve">ובתוך המשפחה והחברים? תמיד, כשרק התחלנו לדבר על זה סביב השולחן, כמעט כולם אמרו לנו: "למה אתם צריכים את זה? מה זה ייתן לכם? למה להתעקש? למה להיות שונים?" והיו גם כאלה שלא אמרו כלום, רק נתנו את התחושה: "בסדר, תנסו. לא תצליחו."</w:t>
+      </w:r>
+    </w:p>
+    <w:p>
+      <w:pPr>
+        <w:bidi/>
+        <w:spacing w:after="160" w:line="360"/>
+        <w:jc w:val="both"/>
+      </w:pPr>
+      <w:r>
+        <w:rPr>
+          <w:rFonts w:ascii="Arial" w:cs="Arial" w:hAnsi="Arial"/>
+          <w:rtl/>
+        </w:rPr>
+        <w:t xml:space="preserve">ותמיד חוזרת המנטרה, שוב ושוב: אי אפשר. לא עכשיו. מחר. עוד שנה.</w:t>
       </w:r>
     </w:p>
     <w:p>
@@ -237,21 +223,21 @@
           <w:rFonts w:ascii="Arial" w:cs="Arial" w:hAnsi="Arial"/>
           <w:rtl/>
         </w:rPr>
-        <w:t xml:space="preserve">ובינתיים המשכנו כמו כולם לעלות על רכבות , גם זאת שעל הפסים וגם המטאפורית. קם בבוקר לפני שמישהו בכלל חושב להתעורר, מתארגן מהר-מהר, פקק בדרך לרכבת, הרכבת מתעכבת, ומגיע לעבודה כשחצי יום כבר נשרף. ואז יושבים מול המקלדת בלי לזוז, שחס וחלילה לא תהיה לנו הפסקה. נגמר היום, חוזרים הביתה, ולפעמים מפספסים את הרכבת ומחכים שעה לבאה, במקרה הטוב. וכולם מגיעים לעבודה חולים, כי אסור לפספס יום.</w:t>
-      </w:r>
-    </w:p>
-    <w:p>
-      <w:pPr>
-        <w:bidi/>
-        <w:spacing w:after="160" w:line="360"/>
-        <w:jc w:val="both"/>
-      </w:pPr>
-      <w:r>
-        <w:rPr>
-          <w:rFonts w:ascii="Arial" w:cs="Arial" w:hAnsi="Arial"/>
-          <w:rtl/>
-        </w:rPr>
-        <w:t xml:space="preserve">זאת הייתה הרכבת שלי. שכל אחד יחשוב איפה הרכבת שלו, לא רק זאת שעל הפסים, אלא הרכבת של החיים.</w:t>
+        <w:t xml:space="preserve">ובינתיים המשכתי כמו כולם לעלות על רכבות, גם זאת שעל הפסים וגם המטאפורית. קם בבוקר לפני שמישהו בכלל חושב להתעורר, מתארגן מהר-מהר, פקק בדרך לרכבת, הרכבת מתעכבת, ומגיע לעבודה כשחצי יום כבר נשרף. ואז יושבים מול המקלדת בלי לזוז, שחס וחלילה לא תהיה לנו הפסקה. נגמר היום, חוזרים הביתה, ולפעמים מפספסים את הרכבת ומחכים שעה לבאה, במקרה הטוב. וכולם מגיעים לעבודה חולים, כי אסור לפספס יום.</w:t>
+      </w:r>
+    </w:p>
+    <w:p>
+      <w:pPr>
+        <w:bidi/>
+        <w:spacing w:after="160" w:line="360"/>
+        <w:jc w:val="both"/>
+      </w:pPr>
+      <w:r>
+        <w:rPr>
+          <w:rFonts w:ascii="Arial" w:cs="Arial" w:hAnsi="Arial"/>
+          <w:rtl/>
+        </w:rPr>
+        <w:t xml:space="preserve">זאת הייתה הרכבת שלי. שכל אחד יחשוב איפה הרכבת שלו. לא רק זאת שעל הפסים, אלא הרכבת של החיים.</w:t>
       </w:r>
     </w:p>
     <w:p>
@@ -265,77 +251,119 @@
           <w:rFonts w:ascii="Arial" w:cs="Arial" w:hAnsi="Arial"/>
           <w:rtl/>
         </w:rPr>
-        <w:t xml:space="preserve">חלק 2 · ההחלטה</w:t>
-      </w:r>
-    </w:p>
-    <w:p>
-      <w:pPr>
-        <w:bidi/>
-        <w:spacing w:after="160" w:line="360"/>
-        <w:jc w:val="both"/>
-      </w:pPr>
-      <w:r>
-        <w:rPr>
-          <w:rFonts w:ascii="Arial" w:cs="Arial" w:hAnsi="Arial"/>
-          <w:rtl/>
-        </w:rPr>
-        <w:t xml:space="preserve">יום אחד, בעבודה שהייתי בה כבר שנים, קולגה זרק לי משפט בזלזול, משהו כמו: "אתה? לא מסוגל." להתקדם, להיות במקום אחר, מתפתח יותר. ובאותה תקופה, האמת, באמת הרגשתי תקוע, בנוח שלי. וזאת הייתה עוד סטירה, אבל הפעם ישר למוח. היא איפסה אותי.</w:t>
-      </w:r>
-    </w:p>
-    <w:p>
-      <w:pPr>
-        <w:bidi/>
-        <w:spacing w:after="160" w:line="360"/>
-        <w:jc w:val="both"/>
-      </w:pPr>
-      <w:r>
-        <w:rPr>
-          <w:rFonts w:ascii="Arial" w:cs="Arial" w:hAnsi="Arial"/>
-          <w:rtl/>
-        </w:rPr>
-        <w:t xml:space="preserve">ואז, פאסט פורוורד: עשיתי שיפט. הגעתי ליעדים שהצבתי לעצמי, עבדתי בחברות כמו פלייטיקה וצ'ק פוינט, והאופי שלי השתנה במאה שמונים מעלות. גיליתי בעצמי יכולות שלא הכרתי רוב החיים שלי.</w:t>
-      </w:r>
-    </w:p>
-    <w:p>
-      <w:pPr>
-        <w:bidi/>
-        <w:spacing w:after="160" w:line="360"/>
-        <w:jc w:val="both"/>
-      </w:pPr>
-      <w:r>
-        <w:rPr>
-          <w:rFonts w:ascii="Arial" w:cs="Arial" w:hAnsi="Arial"/>
-          <w:rtl/>
-        </w:rPr>
-        <w:t xml:space="preserve">ואז לימים הגיע השביעי באוקטובר. ישבתי נעול בממ"ד, קרה כל מה שקרה ולאט לאט בפעם הראשונה, הבנתי: לא הייתי נעול בממ“ד רק באותו היום, מטאפורית אני כבר שנים. ממ"ד שנקרא "אי אפשר", "לא עכשיו", "מחר", "עוד שנה“.</w:t>
-      </w:r>
-    </w:p>
-    <w:p>
-      <w:pPr>
-        <w:bidi/>
-        <w:spacing w:after="160" w:line="360"/>
-        <w:jc w:val="both"/>
-      </w:pPr>
-      <w:r>
-        <w:rPr>
-          <w:rFonts w:ascii="Arial" w:cs="Arial" w:hAnsi="Arial"/>
-          <w:rtl/>
-        </w:rPr>
-        <w:t xml:space="preserve">ואז משהו התחיל לזוז, אבל עדיין לא ידעתי לאן. כל יום ראיתי ושמעתי על אנשים שעזבו הכול, על אנשים ששינו משהו, על אנשים שפשוט התחילו לזוז. ואני? עדיין רצתי לרכבת.</w:t>
-      </w:r>
-    </w:p>
-    <w:p>
-      <w:pPr>
-        <w:bidi/>
-        <w:spacing w:after="160" w:line="360"/>
-        <w:jc w:val="both"/>
-      </w:pPr>
-      <w:r>
-        <w:rPr>
-          <w:rFonts w:ascii="Arial" w:cs="Arial" w:hAnsi="Arial"/>
-          <w:rtl/>
-        </w:rPr>
-        <w:t xml:space="preserve">ואז, פתאום, נולד הבן שלי. והתחלתי לעשות משהו שבעיניי היה הכי בסיסי בעולם: לצאת מהעבודה בחמש, להגיע הביתה בשש וחצי במקרה הטוב, לעזור לאשתי ולהיות עם הבן שלי. כדי שהוא יכיר את אבא שלו, ולא יהיה הילד שאבא שלו יוצא כשהוא ישן וחוזר כשהוא ישן.</w:t>
+        <w:t xml:space="preserve">חלק 2 · נקודת המפנה</w:t>
+      </w:r>
+    </w:p>
+    <w:p>
+      <w:pPr>
+        <w:bidi/>
+        <w:spacing w:after="160" w:line="360"/>
+        <w:jc w:val="both"/>
+      </w:pPr>
+      <w:r>
+        <w:rPr>
+          <w:rFonts w:ascii="Arial" w:cs="Arial" w:hAnsi="Arial"/>
+          <w:rtl/>
+        </w:rPr>
+        <w:t xml:space="preserve">יום אחד, בעבודה שהייתי בה כבר שנים, קולגה זרק לי משפט בזלזול, משהו כמו: "אתה? אתה לא מסוגל." "אולי מי שהחליט לא לתת לך, יש לו סיבה טובה לחשוב את זה." ועוד כל מיני הערות של הקטנה, של "אתה לא תוכל להתקדם, להיות במקום אחר, להתפתח". ובאותה תקופה, האמת, באמת הרגשתי תקוע, בנוח שלי. וזאת הייתה עוד סטירה, אבל הפעם ישר למוח. היא איפסה אותי.</w:t>
+      </w:r>
+    </w:p>
+    <w:p>
+      <w:pPr>
+        <w:bidi/>
+        <w:spacing w:after="160" w:line="360"/>
+        <w:jc w:val="both"/>
+      </w:pPr>
+      <w:r>
+        <w:rPr>
+          <w:rFonts w:ascii="Arial" w:cs="Arial" w:hAnsi="Arial"/>
+          <w:rtl/>
+        </w:rPr>
+        <w:t xml:space="preserve">כי אני מספיק מכיר את עצמי: אין משהו שאני רוצה ולא יכול. תמיד היה ככה.</w:t>
+      </w:r>
+    </w:p>
+    <w:p>
+      <w:pPr>
+        <w:bidi/>
+        <w:spacing w:after="160" w:line="360"/>
+        <w:jc w:val="both"/>
+      </w:pPr>
+      <w:r>
+        <w:rPr>
+          <w:rFonts w:ascii="Arial" w:cs="Arial" w:hAnsi="Arial"/>
+          <w:rtl/>
+        </w:rPr>
+        <w:t xml:space="preserve">אני בטוח שלרבים מאיתנו היה מישהו כזה בחיים, שלא האמין בנו מספיק, ונתן לנו סטירה כל כך מצלצלת שלא יכולנו להמשיך לשבת ולשתוק. אבל לזה עוד אחזור בהמשך.</w:t>
+      </w:r>
+    </w:p>
+    <w:p>
+      <w:pPr>
+        <w:bidi/>
+        <w:spacing w:after="160" w:line="360"/>
+        <w:jc w:val="both"/>
+      </w:pPr>
+      <w:r>
+        <w:rPr>
+          <w:rFonts w:ascii="Arial" w:cs="Arial" w:hAnsi="Arial"/>
+          <w:rtl/>
+        </w:rPr>
+        <w:t xml:space="preserve">ואז, פאסט פורוורד: כמובן שהצלחתי. למדתי ועשיתי שיפט. הגעתי ליעדים שהצבתי לעצמי, עבדתי בחברות כמו פלייטיקה וצ'ק פוינט. אבל מה שיפה הוא שבאותה מידה גם האופי שלי השתנה במאה שמונים מעלות. גיליתי בעצמי עוד הרבה יכולות שלא הכרתי מספיק רוב החיים שלי.</w:t>
+      </w:r>
+    </w:p>
+    <w:p>
+      <w:pPr>
+        <w:bidi/>
+        <w:spacing w:after="160" w:line="360"/>
+        <w:jc w:val="both"/>
+      </w:pPr>
+      <w:r>
+        <w:rPr>
+          <w:rFonts w:ascii="Arial" w:cs="Arial" w:hAnsi="Arial"/>
+          <w:rtl/>
+        </w:rPr>
+        <w:t xml:space="preserve">ושוב, כמו רוטינה, עלו השיחות: "טוב, נמשיך במקומות העבודה האלה, נתקדם, נתפתח, ונעוף מפה." ושוב, חוזר חלילה.</w:t>
+      </w:r>
+    </w:p>
+    <w:p>
+      <w:pPr>
+        <w:bidi/>
+        <w:spacing w:after="160" w:line="360"/>
+        <w:jc w:val="both"/>
+      </w:pPr>
+      <w:r>
+        <w:rPr>
+          <w:rFonts w:ascii="Arial" w:cs="Arial" w:hAnsi="Arial"/>
+          <w:rtl/>
+        </w:rPr>
+        <w:t xml:space="preserve">ואם נתקדם עוד קצת בחיים, אז לימים הגיע השביעי באוקטובר. ישבתי נעול בממ"ד, קרה כל מה שקרה, ולאט-לאט, בפעם הראשונה, זה היכה בי באמת. ההבנה הזאת ש... לא הייתי נעול בממ"ד רק באותו היום. מטאפורית, אני כבר שנים נמצא בסוג של ממ"ד סגור. ממ"ד שנקרא "אי אפשר", "לא עכשיו", "מחר", "עוד שנה".</w:t>
+      </w:r>
+    </w:p>
+    <w:p>
+      <w:pPr>
+        <w:bidi/>
+        <w:spacing w:after="160" w:line="360"/>
+        <w:jc w:val="both"/>
+      </w:pPr>
+      <w:r>
+        <w:rPr>
+          <w:rFonts w:ascii="Arial" w:cs="Arial" w:hAnsi="Arial"/>
+          <w:rtl/>
+        </w:rPr>
+        <w:t xml:space="preserve">ופתאום, אחרי חוויה כל כך מטלטלת, בדמות מחבלים בבית שלנו, שוב משהו התחיל לזוז, אבל הפעם קצת יותר חזק, למרות שעדיין לא ידעתי לאן. וכל יום שעבר ראיתי ושמעתי על עוד ועוד אנשים שעזבו הכול, על אנשים ששינו משהו, על אנשים שפשוט התחילו לזוז. ואני? אם שאלתם, עדיין הייתי אותו בחור שרץ לרכבות.</w:t>
+      </w:r>
+    </w:p>
+    <w:p>
+      <w:pPr>
+        <w:bidi/>
+        <w:spacing w:after="160" w:line="360"/>
+        <w:jc w:val="both"/>
+      </w:pPr>
+      <w:r>
+        <w:rPr>
+          <w:rFonts w:ascii="Arial" w:cs="Arial" w:hAnsi="Arial"/>
+          <w:rtl/>
+        </w:rPr>
+        <w:t xml:space="preserve">ואם נתקדם עוד קצת, אז גם נולד לי הבן הבכור שלי. וזה, בפני עצמו, נותן לך סטירה מטורפת ומניע אותך, בין אם תרצה ובין אם לא. בסוף, יש לך אחריות מטורפת! ואז אתה יושב לילה אחד, הוא נרדם עליך, והכול מתחיל להציף אותך, והמחשבות מתחילות לנדוד: מה אני רוצה לעשות? איפה אני רואה את עצמי? וההחלטה הראשונה שלקחתי, והחלטתי שאני עומד בה לא משנה מה יקרה, היא לצאת בשעה נורמלית הביתה, כדי להספיק לראות את הילד שלי. משהו שבעיניי היה הכי בסיסי בעולם: לצאת מהעבודה בחמש, להגיע הביתה בשש וחצי במקרה הטוב, לעזור לאשתי ולהיות עם הבן שלי. כדי שהוא יכיר את אבא שלו, ולא יהיה הילד שאבא שלו יוצא כשהוא ישן וחוזר כשהוא ישן.</w:t>
       </w:r>
     </w:p>
     <w:p>
@@ -363,49 +391,21 @@
           <w:rFonts w:ascii="Arial" w:cs="Arial" w:hAnsi="Arial"/>
           <w:rtl/>
         </w:rPr>
-        <w:t xml:space="preserve">ואז התחילו ההערות: "חצי יום עבודה, אה?", "אתה יוצא מוקדם מדי, זה בעייתי."</w:t>
-      </w:r>
-    </w:p>
-    <w:p>
-      <w:pPr>
-        <w:bidi/>
-        <w:spacing w:after="160" w:line="360"/>
-        <w:jc w:val="both"/>
-      </w:pPr>
-      <w:r>
-        <w:rPr>
-          <w:rFonts w:ascii="Arial" w:cs="Arial" w:hAnsi="Arial"/>
-          <w:rtl/>
-        </w:rPr>
-        <w:t xml:space="preserve">כל הערה כזאת הייתה סטירה, ועוד סטירה, ועוד אחת. אבל כל סטירה כזאת עשתה משהו מוזר: היא לא הזיזה אותי אחורה, היא דייקה אותי.</w:t>
-      </w:r>
-    </w:p>
-    <w:p>
-      <w:pPr>
-        <w:bidi/>
-        <w:spacing w:after="160" w:line="360"/>
-        <w:jc w:val="both"/>
-      </w:pPr>
-      <w:r>
-        <w:rPr>
-          <w:rFonts w:ascii="Arial" w:cs="Arial" w:hAnsi="Arial"/>
-          <w:rtl/>
-        </w:rPr>
-        <w:t xml:space="preserve">כי הבנתי שמה שיש היום זה לא מה שאני רוצה. אין שום סיכוי בעולם שאני לא אהיה עם אשתי ועם הבן שלי. ומה יהיה שווה את זה יותר?</w:t>
-      </w:r>
-    </w:p>
-    <w:p>
-      <w:pPr>
-        <w:bidi/>
-        <w:spacing w:after="160" w:line="360"/>
-        <w:jc w:val="both"/>
-      </w:pPr>
-      <w:r>
-        <w:rPr>
-          <w:rFonts w:ascii="Arial" w:cs="Arial" w:hAnsi="Arial"/>
-          <w:rtl/>
-        </w:rPr>
-        <w:t xml:space="preserve">אין כזה.</w:t>
+        <w:t xml:space="preserve">ואז, כמובן... ניחשתם נכון. מתחילות ההערות: "חצי יום עבודה, אה?", "אתה יוצא מוקדם מדי, אה? זה בעייתי, זה בעייתי."</w:t>
+      </w:r>
+    </w:p>
+    <w:p>
+      <w:pPr>
+        <w:bidi/>
+        <w:spacing w:after="160" w:line="360"/>
+        <w:jc w:val="both"/>
+      </w:pPr>
+      <w:r>
+        <w:rPr>
+          <w:rFonts w:ascii="Arial" w:cs="Arial" w:hAnsi="Arial"/>
+          <w:rtl/>
+        </w:rPr>
+        <w:t xml:space="preserve">כל הערה כזאת, פתאום אתה מרגיש אותה מהדהדת כפליים. וזה מרגיש כמו סטירה, ועוד סטירה, ועוד אחת. אבל כל סטירה כזאת עשתה משהו מוזר: היא לא הזיזה אותי אחורה, היא דייקה אותי. היא ממש גרמה לי להיות עוד יותר חד ומפוקס לגבי מה שאני באמת רוצה.</w:t>
       </w:r>
     </w:p>
     <w:p>
@@ -419,35 +419,273 @@
           <w:rFonts w:ascii="Arial" w:cs="Arial" w:hAnsi="Arial"/>
           <w:rtl/>
         </w:rPr>
-        <w:t xml:space="preserve">חלק 3 · לתכנת את המוח</w:t>
-      </w:r>
-    </w:p>
-    <w:p>
-      <w:pPr>
-        <w:bidi/>
-        <w:spacing w:after="160" w:line="360"/>
-        <w:jc w:val="both"/>
-      </w:pPr>
-      <w:r>
-        <w:rPr>
-          <w:rFonts w:ascii="Arial" w:cs="Arial" w:hAnsi="Arial"/>
-          <w:rtl/>
-        </w:rPr>
-        <w:t xml:space="preserve">אני רוצה לספר לכם עוד משהו עליי: אני מתכנת במקצוע. כל היום אני כותב קוד כבר המון שנים, מתכנת את המחשב ואומר למחשב מה לעשות, והוא עושה בדיוק מה שכתבתי. לא פחות ולא יותר. (וכן הרבה לפני הai מי ששאל)</w:t>
-      </w:r>
-    </w:p>
-    <w:p>
-      <w:pPr>
-        <w:bidi/>
-        <w:spacing w:after="160" w:line="360"/>
-        <w:jc w:val="both"/>
-      </w:pPr>
-      <w:r>
-        <w:rPr>
-          <w:rFonts w:ascii="Arial" w:cs="Arial" w:hAnsi="Arial"/>
-          <w:rtl/>
-        </w:rPr>
-        <w:t xml:space="preserve">ויום אחד הבנתי שגם המוח שלנו מריץ קוד, גם את המוח שלנו אפשר לתכנת.</w:t>
+        <w:t xml:space="preserve">חלק 3 · הקוד שירשנו</w:t>
+      </w:r>
+    </w:p>
+    <w:p>
+      <w:pPr>
+        <w:bidi/>
+        <w:spacing w:after="160" w:line="360"/>
+        <w:jc w:val="both"/>
+      </w:pPr>
+      <w:r>
+        <w:rPr>
+          <w:rFonts w:ascii="Arial" w:cs="Arial" w:hAnsi="Arial"/>
+          <w:rtl/>
+        </w:rPr>
+        <w:t xml:space="preserve">אז מי כתב את הקוד הזה?</w:t>
+      </w:r>
+    </w:p>
+    <w:p>
+      <w:pPr>
+        <w:bidi/>
+        <w:spacing w:after="160" w:line="360"/>
+        <w:jc w:val="both"/>
+      </w:pPr>
+      <w:r>
+        <w:rPr>
+          <w:rFonts w:ascii="Arial" w:cs="Arial" w:hAnsi="Arial"/>
+          <w:rtl/>
+        </w:rPr>
+        <w:t xml:space="preserve">הרבה ממנו כתבו בשבילנו, כשהיינו ילדים. מדברים שראינו, מדברים ששמענו, מדברים שהחדירו בנו, בלי שאף אחד התכוון.</w:t>
+      </w:r>
+    </w:p>
+    <w:p>
+      <w:pPr>
+        <w:bidi/>
+        <w:spacing w:after="160" w:line="360"/>
+        <w:jc w:val="both"/>
+      </w:pPr>
+      <w:r>
+        <w:rPr>
+          <w:rFonts w:ascii="Arial" w:cs="Arial" w:hAnsi="Arial"/>
+          <w:rtl/>
+        </w:rPr>
+        <w:t xml:space="preserve">ילד לא לומד לפחד מכלבים לבדו. הוא לומד את זה מהפנים של אמא שלו כשהכלב עובר. וזה לא רק משפט יפה: חוקרים הראו את זה במעבדה. ילדים שראו הורה מפחד ממשהו התחילו לפחד מאותו הדבר בעצמם, גם כשלא קרה להם כלום.</w:t>
+      </w:r>
+    </w:p>
+    <w:p>
+      <w:pPr>
+        <w:bidi/>
+        <w:spacing w:after="160" w:line="360"/>
+        <w:jc w:val="both"/>
+      </w:pPr>
+      <w:r>
+        <w:rPr>
+          <w:rFonts w:ascii="Arial" w:cs="Arial" w:hAnsi="Arial"/>
+          <w:rtl/>
+        </w:rPr>
+        <w:t xml:space="preserve">ורוב הפחדים שלנו הם בדיוק זה: קוד שירשנו. ההורים שלנו פחדו. הם לא זזו מאזור הנוחות, לא פגשו חברים, לא יצאו, לא עשו. והם לא אשמים, גם הם קיבלו את הקוד הזה ממישהו.</w:t>
+      </w:r>
+    </w:p>
+    <w:p>
+      <w:pPr>
+        <w:bidi/>
+        <w:spacing w:after="160" w:line="360"/>
+        <w:jc w:val="both"/>
+      </w:pPr>
+      <w:r>
+        <w:rPr>
+          <w:rFonts w:ascii="Arial" w:cs="Arial" w:hAnsi="Arial"/>
+          <w:rtl/>
+        </w:rPr>
+        <w:t xml:space="preserve">חוקרת בשם רחל יהודה בדקה ילדים של ניצולי שואה, ומצאה סימנים לטראומה של ההורים גם בגוף של הילדים. זה מחקר קטן, והמדע עוד לא סגור עליו. אבל כל מי שגדל כאן יודע שיש דברים שעוברים בבית בלי שאף אחד אומר אותם.</w:t>
+      </w:r>
+    </w:p>
+    <w:p>
+      <w:pPr>
+        <w:bidi/>
+        <w:spacing w:after="160" w:line="360"/>
+        <w:jc w:val="both"/>
+      </w:pPr>
+      <w:r>
+        <w:rPr>
+          <w:rFonts w:ascii="Arial" w:cs="Arial" w:hAnsi="Arial"/>
+          <w:rtl/>
+        </w:rPr>
+        <w:t xml:space="preserve">וזה לא רק פחדים, זה גם אמונות. משפטים שקיבלנו מהסביבה, מההורים, לא משנה מאיפה, ואימצנו אותם כאילו הם שלנו: "אני לא טוב עם אנשים", "אני לא טוב בזה", "אני לא טוב בההוא". ומרגע שאימצנו, אנחנו כל היום מחפשים לזה הוכחות, ומוצאים, בכל רגע.</w:t>
+      </w:r>
+    </w:p>
+    <w:p>
+      <w:pPr>
+        <w:bidi/>
+        <w:spacing w:after="160" w:line="360"/>
+        <w:jc w:val="both"/>
+      </w:pPr>
+      <w:r>
+        <w:rPr>
+          <w:rFonts w:ascii="Arial" w:cs="Arial" w:hAnsi="Arial"/>
+          <w:rtl/>
+        </w:rPr>
+        <w:t xml:space="preserve">ופה יש הבדל שלקח לי שנים להבין: ההבדל בין אמונה לבין ידיעה. אמונה זה משהו שמישהו אמר לי, זה נשמע הגיוני, אז אימצתי בלי לבדוק. ידיעה זה לקחת את אותה אמונה ולבדוק אותה: לצבור ידע, להתנסות על עצמי, ולהבין באמת איך זה מרגיש. "אין משרות כאלה" – זאת הייתה אמונה. ועוד מעט אספר לכם מה קרה כשבדקתי.</w:t>
+      </w:r>
+    </w:p>
+    <w:p>
+      <w:pPr>
+        <w:bidi/>
+        <w:spacing w:after="160" w:line="360"/>
+        <w:jc w:val="both"/>
+      </w:pPr>
+      <w:r>
+        <w:rPr>
+          <w:rFonts w:ascii="Arial" w:cs="Arial" w:hAnsi="Arial"/>
+          <w:rtl/>
+        </w:rPr>
+        <w:t xml:space="preserve">ולפני כמעט שישים שנה, שני חוקרים, סליגמן ומאייר, גילו משהו שהם קראו לו "חוסר אונים נלמד". בעלי חיים שלמדו שמה שהם עושים לא משנה כלום הפסיקו לנסות, גם כשכבר יכלו פשוט לצאת. חמישים שנה אחר כך הם חזרו לאותו מחקר והפכו את המסקנה: חוסר האונים בכלל לא נלמד, הוא ברירת המחדל של המוח. מה שצריך ללמוד זה שיש לנו שליטה.</w:t>
+      </w:r>
+    </w:p>
+    <w:p>
+      <w:pPr>
+        <w:bidi/>
+        <w:spacing w:after="160" w:line="360"/>
+        <w:jc w:val="both"/>
+      </w:pPr>
+      <w:r>
+        <w:rPr>
+          <w:rFonts w:ascii="Arial" w:cs="Arial" w:hAnsi="Arial"/>
+          <w:rtl/>
+        </w:rPr>
+        <w:t xml:space="preserve">"אי אפשר" הוא לא תקלה, הוא הגדרות היצרן. ולכתוב מעליו, זה בדיוק לתכנת את המוח.</w:t>
+      </w:r>
+    </w:p>
+    <w:p>
+      <w:pPr>
+        <w:bidi/>
+        <w:spacing w:after="160" w:line="360"/>
+        <w:jc w:val="both"/>
+      </w:pPr>
+      <w:r>
+        <w:rPr>
+          <w:rFonts w:ascii="Arial" w:cs="Arial" w:hAnsi="Arial"/>
+          <w:rtl/>
+        </w:rPr>
+        <w:t xml:space="preserve">אבל אנחנו רוצים, ואנחנו צריכים, להיות אחרים.</w:t>
+      </w:r>
+    </w:p>
+    <w:p>
+      <w:pPr>
+        <w:bidi/>
+        <w:spacing w:after="160" w:line="360"/>
+        <w:jc w:val="both"/>
+      </w:pPr>
+      <w:r>
+        <w:rPr>
+          <w:rFonts w:ascii="Arial" w:cs="Arial" w:hAnsi="Arial"/>
+          <w:rtl/>
+        </w:rPr>
+        <w:t xml:space="preserve">וזה מתחיל בזה שמוכנים להיות העוף המוזר. כל מי שחורג מהנורמה נחשב קיצוני, מוזר. בלי תואר? מוזר. דקל מקדימה של הרגל? מוזר.</w:t>
+      </w:r>
+    </w:p>
+    <w:p>
+      <w:pPr>
+        <w:bidi/>
+        <w:spacing w:after="160" w:line="360"/>
+        <w:jc w:val="both"/>
+      </w:pPr>
+      <w:r>
+        <w:rPr>
+          <w:rFonts w:ascii="Arial" w:cs="Arial" w:hAnsi="Arial"/>
+          <w:rtl/>
+        </w:rPr>
+        <w:t xml:space="preserve">ולמה כל כך קשה להיות שונים? כי אנחנו מתוכנתים להתיישר.</w:t>
+      </w:r>
+    </w:p>
+    <w:p>
+      <w:pPr>
+        <w:bidi/>
+        <w:spacing w:after="160" w:line="360"/>
+        <w:jc w:val="both"/>
+      </w:pPr>
+      <w:r>
+        <w:rPr>
+          <w:rFonts w:ascii="Arial" w:cs="Arial" w:hAnsi="Arial"/>
+          <w:rtl/>
+        </w:rPr>
+        <w:t xml:space="preserve">בדרום אפריקה, חוקרים לימדו קבוצות של קופים שתירס בצבע אחד טעים ובצבע השני מר. אחר כך הם הפסיקו להוסיף את החומר המר, ושני הצבעים היו טעימים בדיוק אותו דבר. והקופים? המשיכו לאכול רק את הצבע "הנכון". הגורים שנולדו אכלו מה שאכלו האמהות. וכשעשרה זכרים עברו לקבוצה שאכלה את הצבע ההפוך, תשעה מהם התחילו מיד לאכול את מה שכולם אכלו. והאחד שלא? זכר האלפא, זה שלא היה צריך את האישור של אף אחד.</w:t>
+      </w:r>
+    </w:p>
+    <w:p>
+      <w:pPr>
+        <w:bidi/>
+        <w:spacing w:after="160" w:line="360"/>
+        <w:jc w:val="both"/>
+      </w:pPr>
+      <w:r>
+        <w:rPr>
+          <w:rFonts w:ascii="Arial" w:cs="Arial" w:hAnsi="Arial"/>
+          <w:rtl/>
+        </w:rPr>
+        <w:t xml:space="preserve">ואצלנו זה לא שונה. בשנות החמישים, חוקר בשם סולומון אש הושיב סטודנט בחדר עם עוד כמה אנשים ושאל שאלה פשוטה: איזה קו הכי ארוך? לבד, כמעט אף אחד לא טעה. אבל כל השאר בחדר היו שתולים, והם ענו בכוונה תשובה לא נכונה. ושלושה מכל ארבעה סטודנטים, לפחות פעם אחת, ויתרו על מה שהעיניים שלהם ראו והלכו עם הקבוצה.</w:t>
+      </w:r>
+    </w:p>
+    <w:p>
+      <w:pPr>
+        <w:bidi/>
+        <w:spacing w:after="160" w:line="360"/>
+        <w:jc w:val="both"/>
+      </w:pPr>
+      <w:r>
+        <w:rPr>
+          <w:rFonts w:ascii="Arial" w:cs="Arial" w:hAnsi="Arial"/>
+          <w:rtl/>
+        </w:rPr>
+        <w:t xml:space="preserve">אבל הנה החלק שאני הכי אוהב. כשאש הכניס לחדר רק אדם אחד שענה אחרת מכולם, ההתיישרות כמעט נעלמה: משליש מהתשובות לחמישה אחוזים. אדם אחד. עוף מוזר אחד.</w:t>
+      </w:r>
+    </w:p>
+    <w:p>
+      <w:pPr>
+        <w:bidi/>
+        <w:spacing w:after="160" w:line="360"/>
+        <w:jc w:val="both"/>
+      </w:pPr>
+      <w:r>
+        <w:rPr>
+          <w:rFonts w:ascii="Arial" w:cs="Arial" w:hAnsi="Arial"/>
+          <w:rtl/>
+        </w:rPr>
+        <w:t xml:space="preserve">זוכרים את הידיים שהרמתם קודם? העוף המוזר? זה לא באג, זה פיצ'ר. וכשאתם מעיזים להיות שונים, אתם לא משחררים רק את עצמכם. אתם משחררים את כל מי שיושב לידכם.</w:t>
+      </w:r>
+    </w:p>
+    <w:p>
+      <w:pPr>
+        <w:pStyle w:val="Heading1"/>
+        <w:bidi/>
+        <w:jc w:val="start"/>
+      </w:pPr>
+      <w:r>
+        <w:rPr>
+          <w:rFonts w:ascii="Arial" w:cs="Arial" w:hAnsi="Arial"/>
+          <w:rtl/>
+        </w:rPr>
+        <w:t xml:space="preserve">חלק 4 · לתכנת את המוח</w:t>
+      </w:r>
+    </w:p>
+    <w:p>
+      <w:pPr>
+        <w:bidi/>
+        <w:spacing w:after="160" w:line="360"/>
+        <w:jc w:val="both"/>
+      </w:pPr>
+      <w:r>
+        <w:rPr>
+          <w:rFonts w:ascii="Arial" w:cs="Arial" w:hAnsi="Arial"/>
+          <w:rtl/>
+        </w:rPr>
+        <w:t xml:space="preserve">אני רוצה לספר לכם עוד משהו עליי: אני מתכנת במקצוע. כבר המון שנים אני כותב קוד כל היום, מתכנת את המחשב ואומר לו מה לעשות, והוא עושה בדיוק מה שכתבתי. לא פחות ולא יותר. (וכן, הרבה לפני ה-AI, למי ששאל.)</w:t>
+      </w:r>
+    </w:p>
+    <w:p>
+      <w:pPr>
+        <w:bidi/>
+        <w:spacing w:after="160" w:line="360"/>
+        <w:jc w:val="both"/>
+      </w:pPr>
+      <w:r>
+        <w:rPr>
+          <w:rFonts w:ascii="Arial" w:cs="Arial" w:hAnsi="Arial"/>
+          <w:rtl/>
+        </w:rPr>
+        <w:t xml:space="preserve">ויום אחד הבנתי שגם המוח שלנו מריץ קוד. שגם את המוח שלנו אפשר לתכנת.</w:t>
       </w:r>
     </w:p>
     <w:p>
@@ -489,21 +727,21 @@
           <w:rFonts w:ascii="Arial" w:cs="Arial" w:hAnsi="Arial"/>
           <w:rtl/>
         </w:rPr>
-        <w:t xml:space="preserve">כמה פעמים יצא לכם שהגעתם הביתה ואמרתם לעצמכם וואי איך הגעתי עד לפה, נסעתם על אוטומט עד לבית, הרגל אתם כבר מתורגלים בדרך שלכם הביתה מה שנקרא בעיניים עצומות</w:t>
-      </w:r>
-    </w:p>
-    <w:p>
-      <w:pPr>
-        <w:bidi/>
-        <w:spacing w:after="160" w:line="360"/>
-        <w:jc w:val="both"/>
-      </w:pPr>
-      <w:r>
-        <w:rPr>
-          <w:rFonts w:ascii="Arial" w:cs="Arial" w:hAnsi="Arial"/>
-          <w:rtl/>
-        </w:rPr>
-        <w:t xml:space="preserve">אז איך הקוד הזה נכתב? למשל: פסיכיאטר בשם ג'דסון ברואר הסביר את זה בהרצאת TED בשלוש מילים: טריגר, פעולה, תגמול. אנחנו רעבים, אוכלים עוגה ומרגישים טוב, שמחים ורגועים. והמוח רושם: זה עובד. ואז הוא נהיה יצירתי: "רגע, אם זה עובד על רעב, למה לא על עוד דברים?" נפרדנו מבן זוג? פיטרו אותנו? סתם קשה לנו? עוגה, שוקולד, גלידה, והופ, כבר יותר טוב. והמוח מאמץ את זה כהרגל, על כל דבר.</w:t>
+        <w:t xml:space="preserve">כמה פעמים יצא לכם להגיע הביתה ולהגיד לעצמכם: "וואו, איך הגעתי עד לפה?" נסעתם על אוטומט עד הבית. הרגל. אתם כבר כל כך מתורגלים בדרך הביתה, שאתם עושים אותה, מה שנקרא, בעיניים עצומות.</w:t>
+      </w:r>
+    </w:p>
+    <w:p>
+      <w:pPr>
+        <w:bidi/>
+        <w:spacing w:after="160" w:line="360"/>
+        <w:jc w:val="both"/>
+      </w:pPr>
+      <w:r>
+        <w:rPr>
+          <w:rFonts w:ascii="Arial" w:cs="Arial" w:hAnsi="Arial"/>
+          <w:rtl/>
+        </w:rPr>
+        <w:t xml:space="preserve">אז איך הקוד הזה נכתב? פסיכיאטר בשם ג'דסון ברואר הסביר את זה בהרצאת TED בשלוש מילים: טריגר, פעולה, תגמול. אנחנו רעבים, אוכלים עוגה ומרגישים טוב, שמחים ורגועים. והמוח רושם: זה עובד. ואז הוא נהיה יצירתי: "רגע, אם זה עובד על רעב, למה לא על עוד דברים?" נפרדנו מבן זוג? פיטרו אותנו? סתם קשה לנו? עוגה, שוקולד, גלידה, והופ, כבר יותר טוב. והמוח מאמץ את זה כהרגל, על כל דבר.</w:t>
       </w:r>
     </w:p>
     <w:p>
@@ -545,7 +783,7 @@
           <w:rFonts w:ascii="Arial" w:cs="Arial" w:hAnsi="Arial"/>
           <w:rtl/>
         </w:rPr>
-        <w:t xml:space="preserve">אבל יש גם חדשות טובות. לדוגמה :</w:t>
+        <w:t xml:space="preserve">אבל יש גם חדשות טובות. לדוגמה:</w:t>
       </w:r>
     </w:p>
     <w:p>
@@ -573,35 +811,231 @@
           <w:rFonts w:ascii="Arial" w:cs="Arial" w:hAnsi="Arial"/>
           <w:rtl/>
         </w:rPr>
-        <w:t xml:space="preserve">ואתם יודעים כמה זמן זה לוקח לתקן הרגל? חוקרים בלונדון עקבו אחרי אנשים שניסו להתקין הרגל חדש אחד, פשוט, כל יום. בדרך כלל זה לקח בערך 66 יום. אצל חלק 18, ואצל אחרים יותר מ-250. והחלק הכי טוב: מי שפספס יום לא חזר לאפס. הקוד המשיך להיכתב.</w:t>
-      </w:r>
-    </w:p>
-    <w:p>
-      <w:pPr>
-        <w:bidi/>
-        <w:spacing w:after="160" w:line="360"/>
-        <w:jc w:val="both"/>
-      </w:pPr>
-      <w:r>
-        <w:rPr>
-          <w:rFonts w:ascii="Arial" w:cs="Arial" w:hAnsi="Arial"/>
-          <w:rtl/>
-        </w:rPr>
-        <w:t xml:space="preserve">ואני? כל החיים שלי אני מרגיש שאני מתכנת את המוח שלי ולוקח אותו למסעות.</w:t>
-      </w:r>
-    </w:p>
-    <w:p>
-      <w:pPr>
-        <w:bidi/>
-        <w:spacing w:after="160" w:line="360"/>
-        <w:jc w:val="both"/>
-      </w:pPr>
-      <w:r>
-        <w:rPr>
-          <w:rFonts w:ascii="Arial" w:cs="Arial" w:hAnsi="Arial"/>
-          <w:rtl/>
-        </w:rPr>
-        <w:t xml:space="preserve">למשל קפצתי ממטוס, פעמיים.</w:t>
+        <w:t xml:space="preserve">ואתם יודעים כמה זמן לוקח לתקן הרגל? חוקרים בלונדון עקבו אחרי אנשים שניסו להתקין הרגל חדש אחד, פשוט, כל יום. בדרך כלל זה לקח בערך 66 יום. אצל חלק 18, ואצל אחרים יותר מ-250. והחלק הכי טוב: מי שפספס יום לא חזר לאפס. הקוד המשיך להיכתב.</w:t>
+      </w:r>
+    </w:p>
+    <w:p>
+      <w:pPr>
+        <w:bidi/>
+        <w:spacing w:after="160" w:line="360"/>
+        <w:jc w:val="both"/>
+      </w:pPr>
+      <w:r>
+        <w:rPr>
+          <w:rFonts w:ascii="Arial" w:cs="Arial" w:hAnsi="Arial"/>
+          <w:rtl/>
+        </w:rPr>
+        <w:t xml:space="preserve">יש מישהו שהשפיע עליי מאוד בדרך הזאת: ד"ר ג'ו דיספנזה. הוא מגדיר הרגל בצורה הכי מדויקת ששמעתי: רצף של מחשבות, התנהגויות ורגשות שחזרנו עליהם כל כך הרבה פעמים, שהגוף כבר יודע לעשות אותם יותר טוב מהמוח.</w:t>
+      </w:r>
+    </w:p>
+    <w:p>
+      <w:pPr>
+        <w:bidi/>
+        <w:spacing w:after="160" w:line="360"/>
+        <w:jc w:val="both"/>
+      </w:pPr>
+      <w:r>
+        <w:rPr>
+          <w:rFonts w:ascii="Arial" w:cs="Arial" w:hAnsi="Arial"/>
+          <w:rtl/>
+        </w:rPr>
+        <w:t xml:space="preserve">תחשבו על הבוקר שלכם. פותחים עיניים, ועוד לפני שקמנו אנחנו כבר חושבים על הבעיות. והבעיות האלה הן זיכרונות: של אנשים, של מקומות, של דברים שקרו. וזיכרון מביא איתו רגש. אז עוד לפני שיצאנו מהמיטה, אנחנו כבר מרגישים את אתמול. ואז הטלפון: הודעות, רשתות, אותם אתרים, באותו סדר. אותה רכבת, כל בוקר.</w:t>
+      </w:r>
+    </w:p>
+    <w:p>
+      <w:pPr>
+        <w:bidi/>
+        <w:spacing w:after="160" w:line="360"/>
+        <w:jc w:val="both"/>
+      </w:pPr>
+      <w:r>
+        <w:rPr>
+          <w:rFonts w:ascii="Arial" w:cs="Arial" w:hAnsi="Arial"/>
+          <w:rtl/>
+        </w:rPr>
+        <w:t xml:space="preserve">דיספנזה אומר שמחשבה ועוד רגש, זה מי שאנחנו. וכשאנחנו חושבים ומרגישים מתוך העבר, העתיד שלנו הוא פשוט העבר, בגרסה חוזרת.</w:t>
+      </w:r>
+    </w:p>
+    <w:p>
+      <w:pPr>
+        <w:bidi/>
+        <w:spacing w:after="160" w:line="360"/>
+        <w:jc w:val="both"/>
+      </w:pPr>
+      <w:r>
+        <w:rPr>
+          <w:rFonts w:ascii="Arial" w:cs="Arial" w:hAnsi="Arial"/>
+          <w:rtl/>
+        </w:rPr>
+        <w:t xml:space="preserve">ומה שהכי קשה: ברגע שמחליטים לבחור משהו חדש, הגוף מושך אחורה, אל המוכר. פתאום מגיעים הספקות, הדחיינות, התירוצים. זה לא חולשה, זה הקוד הישן שמגן על עצמו.</w:t>
+      </w:r>
+    </w:p>
+    <w:p>
+      <w:pPr>
+        <w:bidi/>
+        <w:spacing w:after="160" w:line="360"/>
+        <w:jc w:val="both"/>
+      </w:pPr>
+      <w:r>
+        <w:rPr>
+          <w:rFonts w:ascii="Arial" w:cs="Arial" w:hAnsi="Arial"/>
+          <w:rtl/>
+        </w:rPr>
+        <w:t xml:space="preserve">אז איך כותבים קוד חדש? דיספנזה מדבר על חזרה מנטלית: לעצום עיניים ולדמיין, בפירוט מלא, את מה שאתם רוצים לעשות ואיך אתם רוצים להגיב. וזה לא רק רוחני. חוקר מוח בשם אלברו פסקואל-לאונה ביקש מאנשים לתרגל קטע בפסנתר חמישה ימים. חלק ניגנו באמת, וחלק רק דמיינו שהם מנגנים. ובשתי הקבוצות, האזור במוח ששולט באצבעות השתנה באופן דומה. המוח התחיל לכתוב את הקוד עוד לפני שהאצבעות נגעו בקלידים.</w:t>
+      </w:r>
+    </w:p>
+    <w:p>
+      <w:pPr>
+        <w:bidi/>
+        <w:spacing w:after="160" w:line="360"/>
+        <w:jc w:val="both"/>
+      </w:pPr>
+      <w:r>
+        <w:rPr>
+          <w:rFonts w:ascii="Arial" w:cs="Arial" w:hAnsi="Arial"/>
+          <w:rtl/>
+        </w:rPr>
+        <w:t xml:space="preserve">והחלק הכי קשה הוא ללמד את הגוף להרגיש את העתיד, עוד לפני שהוא קרה. אי אפשר לחכות להצלחה כדי להרגיש חזקים. אי אפשר לחכות לכסף כדי להרגיש שפע. אי אפשר לחכות לזוגיות כדי להרגיש אהובים. דיספנזה קורא לזה המעבר מקורבן ליוצר: מ"אני מרגיש ככה בגלל מה שקרה לי", ל"מה שאני חושב ומרגיש, זה מה שמשנה את מה שיקרה לי".</w:t>
+      </w:r>
+    </w:p>
+    <w:p>
+      <w:pPr>
+        <w:bidi/>
+        <w:spacing w:after="160" w:line="360"/>
+        <w:jc w:val="both"/>
+      </w:pPr>
+      <w:r>
+        <w:rPr>
+          <w:rFonts w:ascii="Arial" w:cs="Arial" w:hAnsi="Arial"/>
+          <w:rtl/>
+        </w:rPr>
+        <w:t xml:space="preserve">והוא לוקח את זה גם לפיזיקה הקוונטית. אני לא פיזיקאי, ואני לא הולך להעמיד פנים שאני כן. אבל יש שם רעיון אחד שאני אוהב כמטאפורה: בעולם הקוונטי, חלקיק מתנהג כמו גל, וברגע שמודדים אותו הוא מתנהג כמו חלקיק. עצם המדידה משנה את מה שרואים. פיזיקאים יגידו לכם, ובצדק, שזה בגלל המדידה ולא בגלל המבט. אבל כמטאפורה? זה בדיוק מה שקורה אצלנו: איפה שאנחנו שמים את תשומת הלב, שם המציאות שלנו מתעצבת.</w:t>
+      </w:r>
+    </w:p>
+    <w:p>
+      <w:pPr>
+        <w:bidi/>
+        <w:spacing w:after="160" w:line="360"/>
+        <w:jc w:val="both"/>
+      </w:pPr>
+      <w:r>
+        <w:rPr>
+          <w:rFonts w:ascii="Arial" w:cs="Arial" w:hAnsi="Arial"/>
+          <w:rtl/>
+        </w:rPr>
+        <w:t xml:space="preserve">מכירים את תרגיל המכונית האדומה? תחליטו עכשיו שאתם קונים מכונית אדומה, ומחר תראו אותן בכל מקום. הן היו שם גם קודם. פשוט לא שמתם לב.</w:t>
+      </w:r>
+    </w:p>
+    <w:p>
+      <w:pPr>
+        <w:bidi/>
+        <w:spacing w:after="160" w:line="360"/>
+        <w:jc w:val="both"/>
+      </w:pPr>
+      <w:r>
+        <w:rPr>
+          <w:rFonts w:ascii="Arial" w:cs="Arial" w:hAnsi="Arial"/>
+          <w:rtl/>
+        </w:rPr>
+        <w:t xml:space="preserve">אם אני אומר "אני רוצה זוגיות", איפה תשומת הלב שלי? על מה שאין לי. אני בחוסר. אבל אם אני מרגיש איך זה כשיש לי, אני כבר מתנהג כמו מי שיש לו.</w:t>
+      </w:r>
+    </w:p>
+    <w:p>
+      <w:pPr>
+        <w:bidi/>
+        <w:spacing w:after="160" w:line="360"/>
+        <w:jc w:val="both"/>
+      </w:pPr>
+      <w:r>
+        <w:rPr>
+          <w:rFonts w:ascii="Arial" w:cs="Arial" w:hAnsi="Arial"/>
+          <w:rtl/>
+        </w:rPr>
+        <w:t xml:space="preserve">כמה פעמים אמרתם לעצמכם "אני יודע שהיום אני אפגוש מישהו מוכר בסופר", ובום, נתקלתם במישהו? אולי זה קסם, ואולי זה פשוט שהמוח מחפש את מה שאמרנו לו לחפש. זוכרים? מרגע שאימצנו אמונה, אנחנו מחפשים לה הוכחות, ומוצאים. זה עובד לשני הכיוונים. אז למה לא לתכנת אותו לחפש את מה שאנחנו רוצים? כמו מנטרה: אני יודע ומרגיש. אני יודע ומרגיש.</w:t>
+      </w:r>
+    </w:p>
+    <w:p>
+      <w:pPr>
+        <w:bidi/>
+        <w:spacing w:after="160" w:line="360"/>
+        <w:jc w:val="both"/>
+      </w:pPr>
+      <w:r>
+        <w:rPr>
+          <w:rFonts w:ascii="Arial" w:cs="Arial" w:hAnsi="Arial"/>
+          <w:rtl/>
+        </w:rPr>
+        <w:t xml:space="preserve">אבל האם אפשר לעשות את זה כל הזמן? מתי שרוצים? גם במצבי לחץ? לא. ולכן העבודה היא יומיומית, כמו כל קוד: כותבים, מריצים, מתקנים, ושוב.</w:t>
+      </w:r>
+    </w:p>
+    <w:p>
+      <w:pPr>
+        <w:bidi/>
+        <w:spacing w:after="160" w:line="360"/>
+        <w:jc w:val="both"/>
+      </w:pPr>
+      <w:r>
+        <w:rPr>
+          <w:rFonts w:ascii="Arial" w:cs="Arial" w:hAnsi="Arial"/>
+          <w:rtl/>
+        </w:rPr>
+        <w:t xml:space="preserve">יש שיגידו: Fake it till you make it. אני אומר: תתכנתו את זה, עד שזה ירוץ לבד. להגיע למצב שבו אני כבר שם, ואני כבר מרגיש את זה.</w:t>
+      </w:r>
+    </w:p>
+    <w:p>
+      <w:pPr>
+        <w:bidi/>
+        <w:spacing w:after="160" w:line="360"/>
+        <w:jc w:val="both"/>
+      </w:pPr>
+      <w:r>
+        <w:rPr>
+          <w:rFonts w:ascii="Arial" w:cs="Arial" w:hAnsi="Arial"/>
+          <w:rtl/>
+        </w:rPr>
+        <w:t xml:space="preserve">יש אמרה ישנה: אנשים ממשיכים לבקש מאלוהים שישנה להם את המצב, את הסיטואציה, במקום להבין שאלוהים שם אותם בסיטואציה הזאת כדי שהם ישנו אותה.</w:t>
+      </w:r>
+    </w:p>
+    <w:p>
+      <w:pPr>
+        <w:bidi/>
+        <w:spacing w:after="160" w:line="360"/>
+        <w:jc w:val="both"/>
+      </w:pPr>
+      <w:r>
+        <w:rPr>
+          <w:rFonts w:ascii="Arial" w:cs="Arial" w:hAnsi="Arial"/>
+          <w:rtl/>
+        </w:rPr>
+        <w:t xml:space="preserve">וסיימון סינק אמר משהו שאני מאוד אוהב: "אף אחד מאיתנו, בדיוק אפס אנשים על כדור הארץ, לא חזק מספיק כדי לעשות את מה שאנחנו מדברים עליו לבד. זה קשה מדי. הדבר הזה שנקרא חיים, הדבר הזה שנקרא מנהיגות: פשוט אף אחד מאיתנו לא חכם מספיק או חזק מספיק כדי לעשות את זה לבד."</w:t>
+      </w:r>
+    </w:p>
+    <w:p>
+      <w:pPr>
+        <w:bidi/>
+        <w:spacing w:after="160" w:line="360"/>
+        <w:jc w:val="both"/>
+      </w:pPr>
+      <w:r>
+        <w:rPr>
+          <w:rFonts w:ascii="Arial" w:cs="Arial" w:hAnsi="Arial"/>
+          <w:rtl/>
+        </w:rPr>
+        <w:t xml:space="preserve">"הסיבה שיש לך אומץ לקפוץ ממטוס תקין לגמרי היא המצנח שעל הגב שלך. זה הדבר החיצוני שנותן לך את האומץ. כל מה שאנחנו צריכים זה אדם אחד בחיים שלנו, רק אחד, שאומר: 'אני מאמין בך, אני איתך, ואם כל העניין הזה ישתבש, אני עדיין אהיה שם בשבילך.' וזה מה שנותן לך את הכוח לעשות כל מה שצריך לעשות."</w:t>
+      </w:r>
+    </w:p>
+    <w:p>
+      <w:pPr>
+        <w:bidi/>
+        <w:spacing w:after="160" w:line="360"/>
+        <w:jc w:val="both"/>
+      </w:pPr>
+      <w:r>
+        <w:rPr>
+          <w:rFonts w:ascii="Arial" w:cs="Arial" w:hAnsi="Arial"/>
+          <w:rtl/>
+        </w:rPr>
+        <w:t xml:space="preserve">לכן חשוב לדבר על כל מה שעובר עליך, הטוב והרע, כי אתה צריך את האנשים האלה. אנחנו צריכים לבנות את האמון הזה, כדי שמישהו יוכל להיות שם בשבילנו.</w:t>
       </w:r>
     </w:p>
     <w:p>
@@ -615,244 +1049,6 @@
           <w:rFonts w:ascii="Arial" w:cs="Arial" w:hAnsi="Arial"/>
           <w:rtl/>
         </w:rPr>
-        <w:t xml:space="preserve">חלק 4 · הקוד שירשנו</w:t>
-      </w:r>
-    </w:p>
-    <w:p>
-      <w:pPr>
-        <w:bidi/>
-        <w:spacing w:after="160" w:line="360"/>
-        <w:jc w:val="both"/>
-      </w:pPr>
-      <w:r>
-        <w:rPr>
-          <w:rFonts w:ascii="Arial" w:cs="Arial" w:hAnsi="Arial"/>
-          <w:rtl/>
-        </w:rPr>
-        <w:t xml:space="preserve">אז מי כתב את הקוד הזה?</w:t>
-      </w:r>
-    </w:p>
-    <w:p>
-      <w:pPr>
-        <w:bidi/>
-        <w:spacing w:after="160" w:line="360"/>
-        <w:jc w:val="both"/>
-      </w:pPr>
-      <w:r>
-        <w:rPr>
-          <w:rFonts w:ascii="Arial" w:cs="Arial" w:hAnsi="Arial"/>
-          <w:rtl/>
-        </w:rPr>
-        <w:t xml:space="preserve">הרבה ממנו כתבו בשבילנו, כשהיינו ילדים. מדברים שראינו, מדברים ששמענו, מדברים שהחדירו בנו, בלי שאף אחד התכוון.</w:t>
-      </w:r>
-    </w:p>
-    <w:p>
-      <w:pPr>
-        <w:bidi/>
-        <w:spacing w:after="160" w:line="360"/>
-        <w:jc w:val="both"/>
-      </w:pPr>
-      <w:r>
-        <w:rPr>
-          <w:rFonts w:ascii="Arial" w:cs="Arial" w:hAnsi="Arial"/>
-          <w:rtl/>
-        </w:rPr>
-        <w:t xml:space="preserve">ילד לא לומד לפחד מכלבים לבדו. הוא לומד את זה מהפנים של אמא שלו כשהכלב עובר. וזה לא רק משפט יפה: חוקרים הראו את זה במעבדה. ילדים שראו הורה מפחד ממשהו התחילו לפחד מאותו הדבר בעצמם, גם כשלא קרה להם כלום.</w:t>
-      </w:r>
-    </w:p>
-    <w:p>
-      <w:pPr>
-        <w:bidi/>
-        <w:spacing w:after="160" w:line="360"/>
-        <w:jc w:val="both"/>
-      </w:pPr>
-      <w:r>
-        <w:rPr>
-          <w:rFonts w:ascii="Arial" w:cs="Arial" w:hAnsi="Arial"/>
-          <w:rtl/>
-        </w:rPr>
-        <w:t xml:space="preserve">ורוב הפחדים שלנו הם בדיוק זה: קוד שירשנו. ההורים שלנו פחדו. הם לא זזו מאזור הנוחות, לא פגשו חברים, לא יצאו, לא עשו. והם לא אשמים, גם הם קיבלו את הקוד הזה ממישהו.</w:t>
-      </w:r>
-    </w:p>
-    <w:p>
-      <w:pPr>
-        <w:bidi/>
-        <w:spacing w:after="160" w:line="360"/>
-        <w:jc w:val="both"/>
-      </w:pPr>
-      <w:r>
-        <w:rPr>
-          <w:rFonts w:ascii="Arial" w:cs="Arial" w:hAnsi="Arial"/>
-          <w:rtl/>
-        </w:rPr>
-        <w:t xml:space="preserve">חוקרת בשם רחל יהודה בדקה ילדים של ניצולי שואה, ומצאה סימנים לטראומה של ההורים גם בגוף של הילדים. זה מחקר קטן, והמדע עוד לא סגור עליו. אבל כל מי שגדל כאן יודע שיש דברים שעוברים בבית בלי שאף אחד אומר אותם.</w:t>
-      </w:r>
-    </w:p>
-    <w:p>
-      <w:pPr>
-        <w:bidi/>
-        <w:spacing w:after="160" w:line="360"/>
-        <w:jc w:val="both"/>
-      </w:pPr>
-      <w:r>
-        <w:rPr>
-          <w:rFonts w:ascii="Arial" w:cs="Arial" w:hAnsi="Arial"/>
-          <w:rtl/>
-        </w:rPr>
-        <w:t xml:space="preserve">וזה לא רק פחדים, זה גם אמונות. משפטים שקיבלנו מהסביבה, מההורים, לא משנה מאיפה, ואימצנו אותם כאילו הם שלנו: "אני לא טוב עם אנשים", "אני לא טוב בזה", "אני לא טוב בההוא". ומרגע שאימצנו, אנחנו כל היום מחפשים לזה הוכחות, ומוצאים, בכל רגע.</w:t>
-      </w:r>
-    </w:p>
-    <w:p>
-      <w:pPr>
-        <w:bidi/>
-        <w:spacing w:after="160" w:line="360"/>
-        <w:jc w:val="both"/>
-      </w:pPr>
-      <w:r>
-        <w:rPr>
-          <w:rFonts w:ascii="Arial" w:cs="Arial" w:hAnsi="Arial"/>
-          <w:rtl/>
-        </w:rPr>
-        <w:t xml:space="preserve">ופה יש הבדל שלקח לי שנים להבין: ההבדל בין אמונה לבין ידיעה. אמונה זה משהו שמישהו אמר לי, זה נשמע הגיוני, אז אימצתי בלי לבדוק. ידיעה זה לקחת את אותה אמונה ולבדוק אותה: לצבור ידע, להתנסות על עצמי, ולהבין באמת איך זה מרגיש. "אין משרות כאלה" – זאת הייתה אמונה. ועוד מעט אספר לכם מה קרה כשבדקתי.</w:t>
-      </w:r>
-    </w:p>
-    <w:p>
-      <w:pPr>
-        <w:bidi/>
-        <w:spacing w:after="160" w:line="360"/>
-        <w:jc w:val="both"/>
-      </w:pPr>
-      <w:r>
-        <w:rPr>
-          <w:rFonts w:ascii="Arial" w:cs="Arial" w:hAnsi="Arial"/>
-          <w:rtl/>
-        </w:rPr>
-        <w:t xml:space="preserve">ולפני כמעט שישים שנה, שני חוקרים, סליגמן ומאייר, גילו משהו שהם קראו לו "חוסר אונים נלמד". בעלי חיים שלמדו שמה שהם עושים לא משנה כלום הפסיקו לנסות, גם כשכבר יכלו פשוט לצאת. חמישים שנה אחר כך הם חזרו לאותו מחקר והפכו את המסקנה: חוסר האונים בכלל לא נלמד, הוא ברירת המחדל של המוח. מה שצריך ללמוד זה שיש לנו שליטה.</w:t>
-      </w:r>
-    </w:p>
-    <w:p>
-      <w:pPr>
-        <w:bidi/>
-        <w:spacing w:after="160" w:line="360"/>
-        <w:jc w:val="both"/>
-      </w:pPr>
-      <w:r>
-        <w:rPr>
-          <w:rFonts w:ascii="Arial" w:cs="Arial" w:hAnsi="Arial"/>
-          <w:rtl/>
-        </w:rPr>
-        <w:t xml:space="preserve">"אי אפשר" הוא לא תקלה, הוא הגדרות היצרן. ולכתוב מעליו, זה בדיוק לתכנת את המוח.</w:t>
-      </w:r>
-    </w:p>
-    <w:p>
-      <w:pPr>
-        <w:bidi/>
-        <w:spacing w:after="160" w:line="360"/>
-        <w:jc w:val="both"/>
-      </w:pPr>
-      <w:r>
-        <w:rPr>
-          <w:rFonts w:ascii="Arial" w:cs="Arial" w:hAnsi="Arial"/>
-          <w:rtl/>
-        </w:rPr>
-        <w:t xml:space="preserve">אבל אנחנו רוצים, ואנחנו צריכים, להיות אחרים.</w:t>
-      </w:r>
-    </w:p>
-    <w:p>
-      <w:pPr>
-        <w:bidi/>
-        <w:spacing w:after="160" w:line="360"/>
-        <w:jc w:val="both"/>
-      </w:pPr>
-      <w:r>
-        <w:rPr>
-          <w:rFonts w:ascii="Arial" w:cs="Arial" w:hAnsi="Arial"/>
-          <w:rtl/>
-        </w:rPr>
-        <w:t xml:space="preserve">וזה מתחיל בזה שמוכנים להיות העוף המוזר. כל מי שחורג מהנורמה נחשב קיצוני, מוזר. בלי תואר? מוזר. דקל מקדימה של הרגל? מוזר.</w:t>
-      </w:r>
-    </w:p>
-    <w:p>
-      <w:pPr>
-        <w:bidi/>
-        <w:spacing w:after="160" w:line="360"/>
-        <w:jc w:val="both"/>
-      </w:pPr>
-      <w:r>
-        <w:rPr>
-          <w:rFonts w:ascii="Arial" w:cs="Arial" w:hAnsi="Arial"/>
-          <w:rtl/>
-        </w:rPr>
-        <w:t xml:space="preserve">ולמה כל כך קשה להיות שונים? כי אנחנו מתוכנתים להתיישר.</w:t>
-      </w:r>
-    </w:p>
-    <w:p>
-      <w:pPr>
-        <w:bidi/>
-        <w:spacing w:after="160" w:line="360"/>
-        <w:jc w:val="both"/>
-      </w:pPr>
-      <w:r>
-        <w:rPr>
-          <w:rFonts w:ascii="Arial" w:cs="Arial" w:hAnsi="Arial"/>
-          <w:rtl/>
-        </w:rPr>
-        <w:t xml:space="preserve">בדרום אפריקה, חוקרים לימדו קבוצות של קופים שתירס בצבע אחד טעים ובצבע השני מר. אחר כך הם הפסיקו להוסיף את החומר המר, ושני הצבעים היו טעימים בדיוק אותו דבר. והקופים? המשיכו לאכול רק את הצבע "הנכון". הגורים שנולדו אכלו מה שאכלו האמהות. וכשעשרה זכרים עברו לקבוצה שאכלה את הצבע ההפוך, תשעה מהם התחילו מיד לאכול את מה שכולם אכלו. והאחד שלא? זכר האלפא, זה שלא היה צריך את האישור של אף אחד.</w:t>
-      </w:r>
-    </w:p>
-    <w:p>
-      <w:pPr>
-        <w:bidi/>
-        <w:spacing w:after="160" w:line="360"/>
-        <w:jc w:val="both"/>
-      </w:pPr>
-      <w:r>
-        <w:rPr>
-          <w:rFonts w:ascii="Arial" w:cs="Arial" w:hAnsi="Arial"/>
-          <w:rtl/>
-        </w:rPr>
-        <w:t xml:space="preserve">ואצלנו זה לא שונה. בשנות החמישים, חוקר בשם סולומון אש הושיב סטודנט בחדר עם עוד כמה אנשים ושאל שאלה פשוטה: איזה קו הכי ארוך? לבד, כמעט אף אחד לא טעה. אבל כל השאר בחדר היו שתולים, והם ענו בכוונה תשובה לא נכונה. ושלושה מכל ארבעה סטודנטים, לפחות פעם אחת, ויתרו על מה שהעיניים שלהם ראו והלכו עם הקבוצה.</w:t>
-      </w:r>
-    </w:p>
-    <w:p>
-      <w:pPr>
-        <w:bidi/>
-        <w:spacing w:after="160" w:line="360"/>
-        <w:jc w:val="both"/>
-      </w:pPr>
-      <w:r>
-        <w:rPr>
-          <w:rFonts w:ascii="Arial" w:cs="Arial" w:hAnsi="Arial"/>
-          <w:rtl/>
-        </w:rPr>
-        <w:t xml:space="preserve">אבל הנה החלק שאני הכי אוהב. כשאש הכניס לחדר רק אדם אחד שענה אחרת מכולם, ההתיישרות כמעט נעלמה: משליש מהתשובות לחמישה אחוזים. אדם אחד. עוף מוזר אחד.</w:t>
-      </w:r>
-    </w:p>
-    <w:p>
-      <w:pPr>
-        <w:bidi/>
-        <w:spacing w:after="160" w:line="360"/>
-        <w:jc w:val="both"/>
-      </w:pPr>
-      <w:r>
-        <w:rPr>
-          <w:rFonts w:ascii="Arial" w:cs="Arial" w:hAnsi="Arial"/>
-          <w:rtl/>
-        </w:rPr>
-        <w:t xml:space="preserve">זוכרים את הידיים שהרמתם קודם? העוף המוזר? זה לא באג, זה פיצ'ר. וכשאתם מעיזים להיות שונים, אתם לא משחררים רק את עצמכם. אתם משחררים את כל מי שיושב לידכם.</w:t>
-      </w:r>
-    </w:p>
-    <w:p>
-      <w:pPr>
-        <w:pStyle w:val="Heading1"/>
-        <w:bidi/>
-        <w:jc w:val="start"/>
-      </w:pPr>
-      <w:r>
-        <w:rPr>
-          <w:rFonts w:ascii="Arial" w:cs="Arial" w:hAnsi="Arial"/>
-          <w:rtl/>
-        </w:rPr>
         <w:t xml:space="preserve">חלק 5 · הקפיצה</w:t>
       </w:r>
     </w:p>
@@ -993,7 +1189,7 @@
           <w:rFonts w:ascii="Arial" w:cs="Arial" w:hAnsi="Arial"/>
           <w:rtl/>
         </w:rPr>
-        <w:t xml:space="preserve">ולא, זה לא היה סרט. נתקענו בבירוקרטיות עם הויזה, והיינו צריכים אפילו לחזור לארץ. ארבעה חודשים, כולל מלחמה עם איראן. אבל לא ויתרתי על שום דבר שכבר החלטתי המוח כבר היה מתוכנת מידי ומחווט מידי. ואחרי ארבעה חודשים לקחנו איתנו גם את הכלבים, ועזבנו. פור גוד.</w:t>
+        <w:t xml:space="preserve">ולא, זה לא היה סרט. נתקענו בבירוקרטיות עם הוויזה, והיינו צריכים אפילו לחזור לארץ. ארבעה חודשים, כולל מלחמה עם איראן. אבל לא ויתרתי על שום דבר שכבר החלטתי. המוח כבר היה מתוכנת מדי, מחווט מדי. ואחרי ארבעה חודשים לקחנו איתנו גם את הכלבים, ועזבנו. פור גוד.</w:t>
       </w:r>
     </w:p>
     <w:p>

</xml_diff>

<commit_message>
Part 5: user's new version, titled הקפיצה / ההחלטה
Adds the jump instructor and the parachute as the callback to Sinek;
drops 'the biggest jump was without a parachute'. Script, editor,
outline and exports synced.

Co-Authored-By: Claude Opus 5.5 <noreply@anthropic.com>
Claude-Session: https://claude.ai/code/session_01QdVJcefjKXQoLjgyoNP2jG
</commit_message>
<xml_diff>
--- a/exports/לתכנת-את-המוח-לעריכה.docx
+++ b/exports/לתכנת-את-המוח-לעריכה.docx
@@ -1049,7 +1049,7 @@
           <w:rFonts w:ascii="Arial" w:cs="Arial" w:hAnsi="Arial"/>
           <w:rtl/>
         </w:rPr>
-        <w:t xml:space="preserve">חלק 5 · הקפיצה</w:t>
+        <w:t xml:space="preserve">חלק 5 · הקפיצה / ההחלטה</w:t>
       </w:r>
     </w:p>
     <w:p>
@@ -1105,7 +1105,7 @@
           <w:rFonts w:ascii="Arial" w:cs="Arial" w:hAnsi="Arial"/>
           <w:rtl/>
         </w:rPr>
-        <w:t xml:space="preserve">ואני יודע שהוא צודק, קפצתי פעמיים. אבל הקפיצה הכי גדולה שלי הייתה בלי מצנח.</w:t>
+        <w:t xml:space="preserve">ואני יודע שהוא צודק, קפצתי פעמיים. וכמו שכבר אמרתי בכמה וכמה חלקים בהרצאה הזאת, אנחנו צריכים מישהו או משהו, כי אנחנו לא יכולים לעשות הכול לבד. כמו שכשצונחים ממטוס, יש לנו את מדריך הצניחה שקופץ איתנו ומחזיק לנו את היד. או שלמדריך הצניחה יש את המצנח שלו.</w:t>
       </w:r>
     </w:p>
     <w:p>

</xml_diff>

<commit_message>
Optional thoughts: {...} marker for lines that may or may not be said
- Markup {...}: editor toolbar button, prompter styles it dim with braces,
  booklet/clean PDF and Word set it in grey italics with a legend note
- Durations show the total with and without optional lines
- The five bracketed sentences in parts 1-2 are marked optional

Co-Authored-By: Claude Opus 5.5 <noreply@anthropic.com>
Claude-Session: https://claude.ai/code/session_01QdVJcefjKXQoLjgyoNP2jG
</commit_message>
<xml_diff>
--- a/exports/לתכנת-את-המוח-לעריכה.docx
+++ b/exports/לתכנת-את-המוח-לעריכה.docx
@@ -18,6 +18,25 @@
     </w:p>
     <w:p>
       <w:pPr>
+        <w:bidi/>
+        <w:spacing w:after="240"/>
+        <w:jc w:val="start"/>
+      </w:pPr>
+      <w:r>
+        <w:rPr>
+          <w:rFonts w:ascii="Arial" w:cs="Arial" w:hAnsi="Arial"/>
+          <w:i/>
+          <w:iCs/>
+          <w:color w:val="8A8F96"/>
+          <w:sz w:val="20"/>
+          <w:szCs w:val="20"/>
+          <w:rtl/>
+        </w:rPr>
+        <w:t xml:space="preserve">טקסט באפור נטוי: מחשבות שאולי ייאמרו ואולי לא.</w:t>
+      </w:r>
+    </w:p>
+    <w:p>
+      <w:pPr>
         <w:pStyle w:val="Heading1"/>
         <w:bidi/>
         <w:jc w:val="start"/>
@@ -139,18 +158,31 @@
           <w:rFonts w:ascii="Arial" w:cs="Arial" w:hAnsi="Arial"/>
           <w:rtl/>
         </w:rPr>
-        <w:t xml:space="preserve">ואצל העוף המוזר הזה, מאז ומתמיד, היה רצון אחד: לעשות דברים אחרת. כשהייתי צעיר יותר זאת הייתה המחשבה לעשות אולי עגלות בחול, וכשגדלתי התחיל לבעור בי מאוד רילוקיישן, לאנשהו, אפילו לתקופה. ואז גיליתי שהאישה שבחרתי לחיים שלי חולקת איתי בדיוק את אותו הרצון.</w:t>
-      </w:r>
-    </w:p>
-    <w:p>
-      <w:pPr>
-        <w:bidi/>
-        <w:spacing w:after="160" w:line="360"/>
-        <w:jc w:val="both"/>
-      </w:pPr>
-      <w:r>
-        <w:rPr>
-          <w:rFonts w:ascii="Arial" w:cs="Arial" w:hAnsi="Arial"/>
+        <w:t xml:space="preserve">ואצל העוף המוזר הזה, מאז ומתמיד, היה רצון אחד: לעשות דברים אחרת. כשהייתי צעיר יותר זאת הייתה המחשבה לעשות אולי עגלות בחול, וכשגדלתי התחיל לבעור בי מאוד רילוקיישן, לאנשהו, אפילו לתקופה. </w:t>
+      </w:r>
+      <w:r>
+        <w:rPr>
+          <w:rFonts w:ascii="Arial" w:cs="Arial" w:hAnsi="Arial"/>
+          <w:i/>
+          <w:iCs/>
+          <w:color w:val="8A8F96"/>
+          <w:rtl/>
+        </w:rPr>
+        <w:t xml:space="preserve">ואז גיליתי שהאישה שבחרתי לחיים שלי חולקת איתי בדיוק את אותו הרצון.</w:t>
+      </w:r>
+    </w:p>
+    <w:p>
+      <w:pPr>
+        <w:bidi/>
+        <w:spacing w:after="160" w:line="360"/>
+        <w:jc w:val="both"/>
+      </w:pPr>
+      <w:r>
+        <w:rPr>
+          <w:rFonts w:ascii="Arial" w:cs="Arial" w:hAnsi="Arial"/>
+          <w:i/>
+          <w:iCs/>
+          <w:color w:val="8A8F96"/>
           <w:rtl/>
         </w:rPr>
         <w:t xml:space="preserve">שנים דיברנו על זה עם כולם: לצאת, לטייל בעולם, לעשות רילוקיישן, משהו.</w:t>
@@ -223,21 +255,48 @@
           <w:rFonts w:ascii="Arial" w:cs="Arial" w:hAnsi="Arial"/>
           <w:rtl/>
         </w:rPr>
-        <w:t xml:space="preserve">ובינתיים המשכתי כמו כולם לעלות על רכבות, גם זאת שעל הפסים וגם המטאפורית. קם בבוקר לפני שמישהו בכלל חושב להתעורר, מתארגן מהר-מהר, פקק בדרך לרכבת, הרכבת מתעכבת, ומגיע לעבודה כשחצי יום כבר נשרף. ואז יושבים מול המקלדת בלי לזוז, שחס וחלילה לא תהיה לנו הפסקה. נגמר היום, חוזרים הביתה, ולפעמים מפספסים את הרכבת ומחכים שעה לבאה, במקרה הטוב. וכולם מגיעים לעבודה חולים, כי אסור לפספס יום.</w:t>
-      </w:r>
-    </w:p>
-    <w:p>
-      <w:pPr>
-        <w:bidi/>
-        <w:spacing w:after="160" w:line="360"/>
-        <w:jc w:val="both"/>
-      </w:pPr>
-      <w:r>
-        <w:rPr>
-          <w:rFonts w:ascii="Arial" w:cs="Arial" w:hAnsi="Arial"/>
-          <w:rtl/>
-        </w:rPr>
-        <w:t xml:space="preserve">זאת הייתה הרכבת שלי. שכל אחד יחשוב איפה הרכבת שלו. לא רק זאת שעל הפסים, אלא הרכבת של החיים.</w:t>
+        <w:t xml:space="preserve">ובינתיים המשכתי כמו כולם לעלות על רכבות</w:t>
+      </w:r>
+      <w:r>
+        <w:rPr>
+          <w:rFonts w:ascii="Arial" w:cs="Arial" w:hAnsi="Arial"/>
+          <w:i/>
+          <w:iCs/>
+          <w:color w:val="8A8F96"/>
+          <w:rtl/>
+        </w:rPr>
+        <w:t xml:space="preserve">, גם זאת שעל הפסים וגם המטאפורית</w:t>
+      </w:r>
+      <w:r>
+        <w:rPr>
+          <w:rFonts w:ascii="Arial" w:cs="Arial" w:hAnsi="Arial"/>
+          <w:rtl/>
+        </w:rPr>
+        <w:t xml:space="preserve">. קם בבוקר לפני שמישהו בכלל חושב להתעורר, מתארגן מהר-מהר, פקק בדרך לרכבת, הרכבת מתעכבת, ומגיע לעבודה כשחצי יום כבר נשרף. ואז יושבים מול המקלדת בלי לזוז, שחס וחלילה לא תהיה לנו הפסקה. נגמר היום, חוזרים הביתה, ולפעמים מפספסים את הרכבת ומחכים שעה לבאה, במקרה הטוב. וכולם מגיעים לעבודה חולים, כי אסור לפספס יום.</w:t>
+      </w:r>
+    </w:p>
+    <w:p>
+      <w:pPr>
+        <w:bidi/>
+        <w:spacing w:after="160" w:line="360"/>
+        <w:jc w:val="both"/>
+      </w:pPr>
+      <w:r>
+        <w:rPr>
+          <w:rFonts w:ascii="Arial" w:cs="Arial" w:hAnsi="Arial"/>
+          <w:rtl/>
+        </w:rPr>
+        <w:t xml:space="preserve">זאת הייתה הרכבת שלי. </w:t>
+      </w:r>
+      <w:r>
+        <w:rPr>
+          <w:rFonts w:ascii="Arial" w:cs="Arial" w:hAnsi="Arial"/>
+          <w:i/>
+          <w:iCs/>
+          <w:color w:val="8A8F96"/>
+          <w:rtl/>
+        </w:rPr>
+        <w:t xml:space="preserve">שכל אחד יחשוב איפה הרכבת שלו. לא רק זאת שעל הפסים, אלא הרכבת של החיים.</w:t>
       </w:r>
     </w:p>
     <w:p>
@@ -375,6 +434,9 @@
       <w:r>
         <w:rPr>
           <w:rFonts w:ascii="Arial" w:cs="Arial" w:hAnsi="Arial"/>
+          <w:i/>
+          <w:iCs/>
+          <w:color w:val="8A8F96"/>
           <w:rtl/>
         </w:rPr>
         <w:t xml:space="preserve">אני יודע איך זה מרגיש כשאבא לא שם.</w:t>

</xml_diff>

<commit_message>
Parachute line (my wife), professional full version, Dispenza library
- Part 4 closes the 'I'll come back to this' promise: my wife was my
  back; today I want to be that for others. Editor, script, exports synced.
- versions/2026-10-03-pro.md: same content and structure as the approved
  text, restyled for stage delivery; notes explain each choice.
  Replaces the short version, which was not what was asked.
- sources/dispenza-library.md: 20 more videos by theme, his own studies
  with verdicts, the studies he cites checked against originals, Hebrew
  resources, and five picks for this talk.

Co-Authored-By: Claude Fable 5.1 <noreply@anthropic.com>
Claude-Session: https://claude.ai/code/session_01QdVJcefjKXQoLjgyoNP2jG
</commit_message>
<xml_diff>
--- a/exports/לתכנת-את-המוח-לעריכה.docx
+++ b/exports/לתכנת-את-המוח-לעריכה.docx
@@ -1098,6 +1098,20 @@
           <w:rtl/>
         </w:rPr>
         <w:t xml:space="preserve">לכן חשוב לדבר על כל מה שעובר עליך, הטוב והרע, כי אתה צריך את האנשים האלה. אנחנו צריכים לבנות את האמון הזה, כדי שמישהו יוכל להיות שם בשבילנו.</w:t>
+      </w:r>
+    </w:p>
+    <w:p>
+      <w:pPr>
+        <w:bidi/>
+        <w:spacing w:after="160" w:line="360"/>
+        <w:jc w:val="both"/>
+      </w:pPr>
+      <w:r>
+        <w:rPr>
+          <w:rFonts w:ascii="Arial" w:cs="Arial" w:hAnsi="Arial"/>
+          <w:rtl/>
+        </w:rPr>
+        <w:t xml:space="preserve">ואצלי? רוב החיים, הגב שלי הייתי אני. גידלתי את עצמי, זוכרים? ובחיים הבוגרים יותר, זאת הייתה אשתי. היא הייתה שם. תמיד. והיום אני רוצה להיות הגב הזה בשביל אחרים.</w:t>
       </w:r>
     </w:p>
     <w:p>

</xml_diff>